<commit_message>
added notes for ForkJoinPool_vs_ExecutorService
</commit_message>
<xml_diff>
--- a/Technology/Java_Knowledge/interviewCracker/Java_interview_cracker/Java/locks_concurrency/How forkJoin.docx
+++ b/Technology/Java_Knowledge/interviewCracker/Java_interview_cracker/Java/locks_concurrency/How forkJoin.docx
@@ -573,6 +573,89 @@
           <w:spacing w:val="2"/>
         </w:rPr>
         <w:t xml:space="preserve"> also uses a last-in, first-out (LIFO) queue configuration.</w:t>
+      </w:r>
+      <w:r>
+        <w:rPr>
+          <w:rFonts w:ascii="Roboto" w:hAnsi="Roboto"/>
+          <w:color w:val="001D35"/>
+          <w:spacing w:val="2"/>
+        </w:rPr>
+        <w:t xml:space="preserve"> </w:t>
+      </w:r>
+    </w:p>
+    <w:p>
+      <w:pPr>
+        <w:pStyle w:val="k3ksmc"/>
+        <w:shd w:val="clear" w:color="auto" w:fill="FFFFFF"/>
+        <w:spacing w:before="0" w:beforeAutospacing="0" w:after="120" w:afterAutospacing="0" w:line="330" w:lineRule="atLeast"/>
+        <w:ind w:left="720"/>
+        <w:rPr>
+          <w:rFonts w:ascii="Roboto" w:hAnsi="Roboto"/>
+          <w:color w:val="001D35"/>
+          <w:spacing w:val="2"/>
+        </w:rPr>
+      </w:pPr>
+      <w:r>
+        <w:rPr>
+          <w:rFonts w:ascii="Segoe UI" w:hAnsi="Segoe UI" w:cs="Segoe UI"/>
+          <w:color w:val="0C0D0E"/>
+          <w:sz w:val="23"/>
+          <w:szCs w:val="23"/>
+          <w:shd w:val="clear" w:color="auto" w:fill="FFFFFF"/>
+        </w:rPr>
+        <w:t>Workers in a </w:t>
+      </w:r>
+      <w:proofErr w:type="spellStart"/>
+      <w:r>
+        <w:rPr>
+          <w:rStyle w:val="HTMLCode"/>
+          <w:rFonts w:ascii="var(--ff-mono)" w:hAnsi="var(--ff-mono)"/>
+          <w:color w:val="0C0D0E"/>
+          <w:bdr w:val="none" w:sz="0" w:space="0" w:color="auto" w:frame="1"/>
+        </w:rPr>
+        <w:t>ForkJoinPool</w:t>
+      </w:r>
+      <w:proofErr w:type="spellEnd"/>
+      <w:r>
+        <w:rPr>
+          <w:rFonts w:ascii="Segoe UI" w:hAnsi="Segoe UI" w:cs="Segoe UI"/>
+          <w:color w:val="0C0D0E"/>
+          <w:sz w:val="23"/>
+          <w:szCs w:val="23"/>
+          <w:shd w:val="clear" w:color="auto" w:fill="FFFFFF"/>
+        </w:rPr>
+        <w:t> in async mode process such tasks in FIFO (first in, first out) order. By default, </w:t>
+      </w:r>
+      <w:proofErr w:type="spellStart"/>
+      <w:r>
+        <w:rPr>
+          <w:rStyle w:val="HTMLCode"/>
+          <w:rFonts w:ascii="var(--ff-mono)" w:hAnsi="var(--ff-mono)"/>
+          <w:color w:val="0C0D0E"/>
+          <w:bdr w:val="none" w:sz="0" w:space="0" w:color="auto" w:frame="1"/>
+        </w:rPr>
+        <w:t>ForkJoinPool</w:t>
+      </w:r>
+      <w:r>
+        <w:rPr>
+          <w:rFonts w:ascii="Segoe UI" w:hAnsi="Segoe UI" w:cs="Segoe UI"/>
+          <w:color w:val="0C0D0E"/>
+          <w:sz w:val="23"/>
+          <w:szCs w:val="23"/>
+          <w:shd w:val="clear" w:color="auto" w:fill="FFFFFF"/>
+        </w:rPr>
+        <w:t>s</w:t>
+      </w:r>
+      <w:proofErr w:type="spellEnd"/>
+      <w:r>
+        <w:rPr>
+          <w:rFonts w:ascii="Segoe UI" w:hAnsi="Segoe UI" w:cs="Segoe UI"/>
+          <w:color w:val="0C0D0E"/>
+          <w:sz w:val="23"/>
+          <w:szCs w:val="23"/>
+          <w:shd w:val="clear" w:color="auto" w:fill="FFFFFF"/>
+        </w:rPr>
+        <w:t xml:space="preserve"> process such tasks in LIFO (last in, first out) order.</w:t>
       </w:r>
     </w:p>
     <w:p>
@@ -747,6 +830,7 @@
           <w:lang w:eastAsia="en-IN"/>
           <w14:ligatures w14:val="none"/>
         </w:rPr>
+        <w:lastRenderedPageBreak/>
         <w:t>Initially ,</w:t>
       </w:r>
       <w:proofErr w:type="gramEnd"/>
@@ -812,20 +896,7 @@
           <w:lang w:eastAsia="en-IN"/>
           <w14:ligatures w14:val="none"/>
         </w:rPr>
-        <w:t xml:space="preserve"> new subtask except the last one </w:t>
-      </w:r>
-      <w:r>
-        <w:rPr>
-          <w:rFonts w:ascii="Lato" w:eastAsia="Times New Roman" w:hAnsi="Lato" w:cs="Times New Roman"/>
-          <w:color w:val="404040"/>
-          <w:kern w:val="0"/>
-          <w:sz w:val="24"/>
-          <w:szCs w:val="24"/>
-          <w:lang w:eastAsia="en-IN"/>
-          <w14:ligatures w14:val="none"/>
-        </w:rPr>
-        <w:lastRenderedPageBreak/>
-        <w:t xml:space="preserve">we compute. After the computation we invoke join to wait for the forked tasks to complete. This divide-and-conquer process continues </w:t>
+        <w:t xml:space="preserve"> new subtask except the last one we compute. After the computation we invoke join to wait for the forked tasks to complete. This divide-and-conquer process continues </w:t>
       </w:r>
       <w:proofErr w:type="spellStart"/>
       <w:r>
@@ -1182,6 +1253,7 @@
           <w:lang w:eastAsia="en-IN"/>
           <w14:ligatures w14:val="none"/>
         </w:rPr>
+        <w:lastRenderedPageBreak/>
         <w:t>A task that uses the fork and join principle can </w:t>
       </w:r>
       <w:r>
@@ -1233,7 +1305,6 @@
           <w:lang w:eastAsia="en-IN"/>
           <w14:ligatures w14:val="none"/>
         </w:rPr>
-        <w:lastRenderedPageBreak/>
         <w:drawing>
           <wp:inline distT="0" distB="0" distL="0" distR="0" wp14:anchorId="3BECECB5" wp14:editId="13944F3E">
             <wp:extent cx="4752975" cy="3190875"/>
@@ -1517,66 +1588,6 @@
           <w14:ligatures w14:val="none"/>
         </w:rPr>
       </w:pPr>
-      <w:r>
-        <w:rPr>
-          <w:rFonts w:ascii="Times New Roman" w:eastAsia="Times New Roman" w:hAnsi="Times New Roman" w:cs="Times New Roman"/>
-          <w:noProof/>
-          <w:kern w:val="0"/>
-          <w:sz w:val="24"/>
-          <w:szCs w:val="24"/>
-          <w:lang w:eastAsia="en-IN"/>
-          <w14:ligatures w14:val="none"/>
-        </w:rPr>
-        <w:lastRenderedPageBreak/>
-        <w:drawing>
-          <wp:inline distT="0" distB="0" distL="0" distR="0" wp14:anchorId="0B41BF43" wp14:editId="28767177">
-            <wp:extent cx="4819650" cy="3181350"/>
-            <wp:effectExtent l="0" t="0" r="0" b="0"/>
-            <wp:docPr id="60083194" name="Picture 1" descr="Merging the results of subtasks is referred to as joining results."/>
-            <wp:cNvGraphicFramePr>
-              <a:graphicFrameLocks xmlns:a="http://schemas.openxmlformats.org/drawingml/2006/main" noChangeAspect="1"/>
-            </wp:cNvGraphicFramePr>
-            <a:graphic xmlns:a="http://schemas.openxmlformats.org/drawingml/2006/main">
-              <a:graphicData uri="http://schemas.openxmlformats.org/drawingml/2006/picture">
-                <pic:pic xmlns:pic="http://schemas.openxmlformats.org/drawingml/2006/picture">
-                  <pic:nvPicPr>
-                    <pic:cNvPr id="0" name="Picture 2" descr="Merging the results of subtasks is referred to as joining results."/>
-                    <pic:cNvPicPr>
-                      <a:picLocks noChangeAspect="1" noChangeArrowheads="1"/>
-                    </pic:cNvPicPr>
-                  </pic:nvPicPr>
-                  <pic:blipFill>
-                    <a:blip r:embed="rId10">
-                      <a:extLst>
-                        <a:ext uri="{28A0092B-C50C-407E-A947-70E740481C1C}">
-                          <a14:useLocalDpi xmlns:a14="http://schemas.microsoft.com/office/drawing/2010/main" val="0"/>
-                        </a:ext>
-                      </a:extLst>
-                    </a:blip>
-                    <a:srcRect/>
-                    <a:stretch>
-                      <a:fillRect/>
-                    </a:stretch>
-                  </pic:blipFill>
-                  <pic:spPr bwMode="auto">
-                    <a:xfrm>
-                      <a:off x="0" y="0"/>
-                      <a:ext cx="4819650" cy="3181350"/>
-                    </a:xfrm>
-                    <a:prstGeom prst="rect">
-                      <a:avLst/>
-                    </a:prstGeom>
-                    <a:noFill/>
-                    <a:ln>
-                      <a:noFill/>
-                    </a:ln>
-                  </pic:spPr>
-                </pic:pic>
-              </a:graphicData>
-            </a:graphic>
-          </wp:inline>
-        </w:drawing>
-      </w:r>
     </w:p>
     <w:p>
       <w:pPr>
@@ -1602,6 +1613,7 @@
           <w:lang w:eastAsia="en-IN"/>
           <w14:ligatures w14:val="none"/>
         </w:rPr>
+        <w:lastRenderedPageBreak/>
         <w:t xml:space="preserve">Of course, not all types of tasks may return a result. If the tasks do not return a </w:t>
       </w:r>
       <w:proofErr w:type="gramStart"/>
@@ -2320,7 +2332,6 @@
           <w:lang w:eastAsia="en-IN"/>
           <w14:ligatures w14:val="none"/>
         </w:rPr>
-        <w:lastRenderedPageBreak/>
         <w:t xml:space="preserve">You can also use the static factory method </w:t>
       </w:r>
       <w:proofErr w:type="spellStart"/>
@@ -2760,6 +2771,7 @@
           <w:lang w:eastAsia="en-IN"/>
           <w14:ligatures w14:val="none"/>
         </w:rPr>
+        <w:lastRenderedPageBreak/>
         <w:t xml:space="preserve">Submitting Tasks to the </w:t>
       </w:r>
       <w:proofErr w:type="spellStart"/>
@@ -4282,7 +4294,6 @@
         </w:rPr>
         <w:t xml:space="preserve">("Splitting </w:t>
       </w:r>
-      <w:proofErr w:type="spellStart"/>
       <w:proofErr w:type="gramStart"/>
       <w:r>
         <w:rPr>
@@ -4294,20 +4305,7 @@
           <w:lang w:eastAsia="en-IN"/>
           <w14:ligatures w14:val="none"/>
         </w:rPr>
-        <w:t>workLoad</w:t>
-      </w:r>
-      <w:proofErr w:type="spellEnd"/>
-      <w:r>
-        <w:rPr>
-          <w:rFonts w:ascii="Courier New" w:eastAsia="Times New Roman" w:hAnsi="Courier New" w:cs="Courier New"/>
-          <w:color w:val="000000"/>
-          <w:kern w:val="0"/>
-          <w:sz w:val="20"/>
-          <w:szCs w:val="20"/>
-          <w:lang w:eastAsia="en-IN"/>
-          <w14:ligatures w14:val="none"/>
-        </w:rPr>
-        <w:t xml:space="preserve"> :</w:t>
+        <w:t>workLoad :</w:t>
       </w:r>
       <w:proofErr w:type="gramEnd"/>
       <w:r>
@@ -5252,6 +5250,7 @@
           <w:lang w:eastAsia="en-IN"/>
           <w14:ligatures w14:val="none"/>
         </w:rPr>
+        <w:lastRenderedPageBreak/>
         <w:t xml:space="preserve">  }</w:t>
       </w:r>
     </w:p>
@@ -7028,7 +7027,6 @@
         </w:rPr>
         <w:t xml:space="preserve">("Splitting </w:t>
       </w:r>
-      <w:proofErr w:type="spellStart"/>
       <w:proofErr w:type="gramStart"/>
       <w:r>
         <w:rPr>
@@ -7040,20 +7038,7 @@
           <w:lang w:eastAsia="en-IN"/>
           <w14:ligatures w14:val="none"/>
         </w:rPr>
-        <w:t>workLoad</w:t>
-      </w:r>
-      <w:proofErr w:type="spellEnd"/>
-      <w:r>
-        <w:rPr>
-          <w:rFonts w:ascii="Courier New" w:eastAsia="Times New Roman" w:hAnsi="Courier New" w:cs="Courier New"/>
-          <w:color w:val="000000"/>
-          <w:kern w:val="0"/>
-          <w:sz w:val="20"/>
-          <w:szCs w:val="20"/>
-          <w:lang w:eastAsia="en-IN"/>
-          <w14:ligatures w14:val="none"/>
-        </w:rPr>
-        <w:t xml:space="preserve"> :</w:t>
+        <w:t>workLoad :</w:t>
       </w:r>
       <w:proofErr w:type="gramEnd"/>
       <w:r>
@@ -7918,6 +7903,7 @@
           <w:lang w:eastAsia="en-IN"/>
           <w14:ligatures w14:val="none"/>
         </w:rPr>
+        <w:lastRenderedPageBreak/>
         <w:t xml:space="preserve">            return result;</w:t>
       </w:r>
     </w:p>
@@ -9272,6 +9258,92 @@
     </w:p>
     <w:p>
       <w:pPr>
+        <w:pStyle w:val="Heading1"/>
+        <w:shd w:val="clear" w:color="auto" w:fill="FFFFFF"/>
+        <w:spacing w:before="0" w:after="360"/>
+        <w:rPr>
+          <w:rFonts w:ascii="Arial" w:hAnsi="Arial" w:cs="Arial"/>
+          <w:color w:val="000000"/>
+        </w:rPr>
+      </w:pPr>
+      <w:r>
+        <w:rPr>
+          <w:rFonts w:ascii="Arial" w:hAnsi="Arial" w:cs="Arial"/>
+          <w:b/>
+          <w:bCs/>
+          <w:color w:val="000000"/>
+        </w:rPr>
+        <w:t xml:space="preserve">How to use </w:t>
+      </w:r>
+      <w:proofErr w:type="spellStart"/>
+      <w:r>
+        <w:rPr>
+          <w:rFonts w:ascii="Arial" w:hAnsi="Arial" w:cs="Arial"/>
+          <w:b/>
+          <w:bCs/>
+          <w:color w:val="000000"/>
+        </w:rPr>
+        <w:t>ForkJoinPool</w:t>
+      </w:r>
+      <w:proofErr w:type="spellEnd"/>
+      <w:r>
+        <w:rPr>
+          <w:rFonts w:ascii="Arial" w:hAnsi="Arial" w:cs="Arial"/>
+          <w:b/>
+          <w:bCs/>
+          <w:color w:val="000000"/>
+        </w:rPr>
+        <w:t xml:space="preserve"> in Java</w:t>
+      </w:r>
+    </w:p>
+    <w:p>
+      <w:pPr>
+        <w:pStyle w:val="Heading2"/>
+        <w:shd w:val="clear" w:color="auto" w:fill="FFFFFF"/>
+        <w:spacing w:before="600" w:beforeAutospacing="0" w:after="600" w:afterAutospacing="0"/>
+        <w:rPr>
+          <w:rFonts w:ascii="Arial" w:hAnsi="Arial" w:cs="Arial"/>
+          <w:b w:val="0"/>
+          <w:bCs w:val="0"/>
+          <w:color w:val="0C0C0C"/>
+          <w:spacing w:val="-2"/>
+        </w:rPr>
+      </w:pPr>
+      <w:r>
+        <w:rPr>
+          <w:rFonts w:ascii="Arial" w:hAnsi="Arial" w:cs="Arial"/>
+          <w:b w:val="0"/>
+          <w:bCs w:val="0"/>
+          <w:color w:val="0C0C0C"/>
+          <w:spacing w:val="-2"/>
+        </w:rPr>
+        <w:t xml:space="preserve">Use </w:t>
+      </w:r>
+      <w:proofErr w:type="spellStart"/>
+      <w:r>
+        <w:rPr>
+          <w:rFonts w:ascii="Arial" w:hAnsi="Arial" w:cs="Arial"/>
+          <w:b w:val="0"/>
+          <w:bCs w:val="0"/>
+          <w:color w:val="0C0C0C"/>
+          <w:spacing w:val="-2"/>
+        </w:rPr>
+        <w:t>ForkJoinPool</w:t>
+      </w:r>
+      <w:proofErr w:type="spellEnd"/>
+      <w:r>
+        <w:rPr>
+          <w:rFonts w:ascii="Arial" w:hAnsi="Arial" w:cs="Arial"/>
+          <w:b w:val="0"/>
+          <w:bCs w:val="0"/>
+          <w:color w:val="0C0C0C"/>
+          <w:spacing w:val="-2"/>
+        </w:rPr>
+        <w:t xml:space="preserve"> to break down computationally intensive tasks and execute them in parallel for better Java application performance.</w:t>
+      </w:r>
+    </w:p>
+    <w:p>
+      <w:pPr>
         <w:pStyle w:val="NormalWeb"/>
         <w:shd w:val="clear" w:color="auto" w:fill="FFFFFF"/>
         <w:spacing w:before="600" w:beforeAutospacing="0" w:after="600" w:afterAutospacing="0"/>
@@ -9283,6 +9355,16 @@
           <w:szCs w:val="27"/>
         </w:rPr>
       </w:pPr>
+      <w:proofErr w:type="spellStart"/>
+      <w:r>
+        <w:rPr>
+          <w:rStyle w:val="HTMLCode"/>
+          <w:color w:val="0000CC"/>
+          <w:spacing w:val="24"/>
+        </w:rPr>
+        <w:t>ForkJoinPool</w:t>
+      </w:r>
+      <w:proofErr w:type="spellEnd"/>
       <w:r>
         <w:rPr>
           <w:rFonts w:ascii="Arial" w:hAnsi="Arial" w:cs="Arial"/>
@@ -9291,28 +9373,7 @@
           <w:sz w:val="27"/>
           <w:szCs w:val="27"/>
         </w:rPr>
-        <w:lastRenderedPageBreak/>
-        <w:t>When the task is submitted in a </w:t>
-      </w:r>
-      <w:proofErr w:type="spellStart"/>
-      <w:r>
-        <w:rPr>
-          <w:rStyle w:val="HTMLCode"/>
-          <w:color w:val="0000CC"/>
-          <w:spacing w:val="24"/>
-        </w:rPr>
-        <w:t>ForkJoinPool</w:t>
-      </w:r>
-      <w:proofErr w:type="spellEnd"/>
-      <w:r>
-        <w:rPr>
-          <w:rFonts w:ascii="Arial" w:hAnsi="Arial" w:cs="Arial"/>
-          <w:color w:val="0C0C0C"/>
-          <w:spacing w:val="-2"/>
-          <w:sz w:val="27"/>
-          <w:szCs w:val="27"/>
-        </w:rPr>
-        <w:t>, the process will be divided into smaller processes and pushed to a shared queue.</w:t>
+        <w:t> is a powerful Java class used for processing computationally intensive tasks. It works by breaking down tasks into smaller subtasks and then executing them in parallel. This thread pool operates using a divide-and-conquer strategy, which enables it to execute tasks concurrently, increasing throughput and reducing processing time.</w:t>
       </w:r>
     </w:p>
     <w:p>
@@ -9336,26 +9397,19 @@
           <w:sz w:val="27"/>
           <w:szCs w:val="27"/>
         </w:rPr>
-        <w:t>Once the </w:t>
-      </w:r>
-      <w:proofErr w:type="gramStart"/>
+        <w:lastRenderedPageBreak/>
+        <w:t>One of the unique features of </w:t>
+      </w:r>
+      <w:proofErr w:type="spellStart"/>
       <w:r>
         <w:rPr>
           <w:rStyle w:val="HTMLCode"/>
           <w:color w:val="0000CC"/>
           <w:spacing w:val="24"/>
         </w:rPr>
-        <w:t>fork(</w:t>
-      </w:r>
-      <w:proofErr w:type="gramEnd"/>
-      <w:r>
-        <w:rPr>
-          <w:rStyle w:val="HTMLCode"/>
-          <w:color w:val="0000CC"/>
-          <w:spacing w:val="24"/>
-        </w:rPr>
-        <w:t>)</w:t>
-      </w:r>
+        <w:t>ForkJoinPool</w:t>
+      </w:r>
+      <w:proofErr w:type="spellEnd"/>
       <w:r>
         <w:rPr>
           <w:rFonts w:ascii="Arial" w:hAnsi="Arial" w:cs="Arial"/>
@@ -9364,35 +9418,7 @@
           <w:sz w:val="27"/>
           <w:szCs w:val="27"/>
         </w:rPr>
-        <w:t> method is invoked, tasks are invoked in parallel until the base condition is true. Once processing is forked, the </w:t>
-      </w:r>
-      <w:proofErr w:type="gramStart"/>
-      <w:r>
-        <w:rPr>
-          <w:rStyle w:val="HTMLCode"/>
-          <w:color w:val="0000CC"/>
-          <w:spacing w:val="24"/>
-        </w:rPr>
-        <w:t>join(</w:t>
-      </w:r>
-      <w:proofErr w:type="gramEnd"/>
-      <w:r>
-        <w:rPr>
-          <w:rStyle w:val="HTMLCode"/>
-          <w:color w:val="0000CC"/>
-          <w:spacing w:val="24"/>
-        </w:rPr>
-        <w:t>)</w:t>
-      </w:r>
-      <w:r>
-        <w:rPr>
-          <w:rFonts w:ascii="Arial" w:hAnsi="Arial" w:cs="Arial"/>
-          <w:color w:val="0C0C0C"/>
-          <w:spacing w:val="-2"/>
-          <w:sz w:val="27"/>
-          <w:szCs w:val="27"/>
-        </w:rPr>
-        <w:t> method ensures that threads wait for each other until the process has been finalized.</w:t>
+        <w:t> is the work-stealing algorithm it uses to optimize performance. When a worker thread finishes its assigned tasks, it will steal tasks from other threads, ensuring that all threads are working efficiently, and no computer resources are wasted.</w:t>
       </w:r>
     </w:p>
     <w:p>
@@ -9408,6 +9434,16 @@
           <w:szCs w:val="27"/>
         </w:rPr>
       </w:pPr>
+      <w:proofErr w:type="spellStart"/>
+      <w:r>
+        <w:rPr>
+          <w:rStyle w:val="HTMLCode"/>
+          <w:color w:val="0000CC"/>
+          <w:spacing w:val="24"/>
+        </w:rPr>
+        <w:t>ForkJoinPool</w:t>
+      </w:r>
+      <w:proofErr w:type="spellEnd"/>
       <w:r>
         <w:rPr>
           <w:rFonts w:ascii="Arial" w:hAnsi="Arial" w:cs="Arial"/>
@@ -9416,9 +9452,569 @@
           <w:sz w:val="27"/>
           <w:szCs w:val="27"/>
         </w:rPr>
+        <w:t> is used extensively in Java’s parallel streams and </w:t>
+      </w:r>
+      <w:proofErr w:type="spellStart"/>
+      <w:r>
+        <w:rPr>
+          <w:rFonts w:ascii="Arial" w:hAnsi="Arial" w:cs="Arial"/>
+          <w:color w:val="0C0C0C"/>
+          <w:spacing w:val="-2"/>
+          <w:sz w:val="27"/>
+          <w:szCs w:val="27"/>
+        </w:rPr>
+        <w:fldChar w:fldCharType="begin"/>
+      </w:r>
+      <w:r>
+        <w:rPr>
+          <w:rFonts w:ascii="Arial" w:hAnsi="Arial" w:cs="Arial"/>
+          <w:color w:val="0C0C0C"/>
+          <w:spacing w:val="-2"/>
+          <w:sz w:val="27"/>
+          <w:szCs w:val="27"/>
+        </w:rPr>
+        <w:instrText>HYPERLINK "https://www.infoworld.com/article/2337970/how-to-use-callbacks-in-java.html"</w:instrText>
+      </w:r>
+      <w:r>
+        <w:rPr>
+          <w:rFonts w:ascii="Arial" w:hAnsi="Arial" w:cs="Arial"/>
+          <w:color w:val="0C0C0C"/>
+          <w:spacing w:val="-2"/>
+          <w:sz w:val="27"/>
+          <w:szCs w:val="27"/>
+        </w:rPr>
+      </w:r>
+      <w:r>
+        <w:rPr>
+          <w:rFonts w:ascii="Arial" w:hAnsi="Arial" w:cs="Arial"/>
+          <w:color w:val="0C0C0C"/>
+          <w:spacing w:val="-2"/>
+          <w:sz w:val="27"/>
+          <w:szCs w:val="27"/>
+        </w:rPr>
+        <w:fldChar w:fldCharType="separate"/>
+      </w:r>
+      <w:r>
+        <w:rPr>
+          <w:rStyle w:val="Hyperlink"/>
+          <w:rFonts w:ascii="Arial" w:hAnsi="Arial" w:cs="Arial"/>
+          <w:color w:val="0C0C0C"/>
+          <w:spacing w:val="-2"/>
+          <w:sz w:val="27"/>
+          <w:szCs w:val="27"/>
+        </w:rPr>
+        <w:t>CompletableFutures</w:t>
+      </w:r>
+      <w:proofErr w:type="spellEnd"/>
+      <w:r>
+        <w:rPr>
+          <w:rFonts w:ascii="Arial" w:hAnsi="Arial" w:cs="Arial"/>
+          <w:color w:val="0C0C0C"/>
+          <w:spacing w:val="-2"/>
+          <w:sz w:val="27"/>
+          <w:szCs w:val="27"/>
+        </w:rPr>
+        <w:fldChar w:fldCharType="end"/>
+      </w:r>
+      <w:r>
+        <w:rPr>
+          <w:rFonts w:ascii="Arial" w:hAnsi="Arial" w:cs="Arial"/>
+          <w:color w:val="0C0C0C"/>
+          <w:spacing w:val="-2"/>
+          <w:sz w:val="27"/>
+          <w:szCs w:val="27"/>
+        </w:rPr>
+        <w:t>, allowing developers to execute tasks concurrently with ease. Additionally, other JVM languages like </w:t>
+      </w:r>
+      <w:hyperlink r:id="rId10" w:history="1">
+        <w:r>
+          <w:rPr>
+            <w:rStyle w:val="Hyperlink"/>
+            <w:rFonts w:ascii="Arial" w:hAnsi="Arial" w:cs="Arial"/>
+            <w:color w:val="0C0C0C"/>
+            <w:spacing w:val="-2"/>
+            <w:sz w:val="27"/>
+            <w:szCs w:val="27"/>
+          </w:rPr>
+          <w:t>Kotlin</w:t>
+        </w:r>
+      </w:hyperlink>
+      <w:r>
+        <w:rPr>
+          <w:rFonts w:ascii="Arial" w:hAnsi="Arial" w:cs="Arial"/>
+          <w:color w:val="0C0C0C"/>
+          <w:spacing w:val="-2"/>
+          <w:sz w:val="27"/>
+          <w:szCs w:val="27"/>
+        </w:rPr>
+        <w:t> and </w:t>
+      </w:r>
+      <w:hyperlink r:id="rId11" w:history="1">
+        <w:r>
+          <w:rPr>
+            <w:rStyle w:val="Hyperlink"/>
+            <w:rFonts w:ascii="Arial" w:hAnsi="Arial" w:cs="Arial"/>
+            <w:color w:val="0C0C0C"/>
+            <w:spacing w:val="-2"/>
+            <w:sz w:val="27"/>
+            <w:szCs w:val="27"/>
+          </w:rPr>
+          <w:t>Akka</w:t>
+        </w:r>
+      </w:hyperlink>
+      <w:r>
+        <w:rPr>
+          <w:rFonts w:ascii="Arial" w:hAnsi="Arial" w:cs="Arial"/>
+          <w:color w:val="0C0C0C"/>
+          <w:spacing w:val="-2"/>
+          <w:sz w:val="27"/>
+          <w:szCs w:val="27"/>
+        </w:rPr>
+        <w:t> use this framework to build message-driven applications that require high concurrency and resilience.</w:t>
+      </w:r>
+    </w:p>
+    <w:p>
+      <w:pPr>
+        <w:pStyle w:val="Heading2"/>
+        <w:shd w:val="clear" w:color="auto" w:fill="FFFFFF"/>
+        <w:spacing w:before="360" w:beforeAutospacing="0" w:after="240" w:afterAutospacing="0"/>
+        <w:rPr>
+          <w:rFonts w:ascii="Arial" w:hAnsi="Arial" w:cs="Arial"/>
+          <w:b w:val="0"/>
+          <w:bCs w:val="0"/>
+          <w:color w:val="0C0C0C"/>
+          <w:spacing w:val="-5"/>
+        </w:rPr>
+      </w:pPr>
+      <w:r>
+        <w:rPr>
+          <w:rFonts w:ascii="Arial" w:hAnsi="Arial" w:cs="Arial"/>
+          <w:b w:val="0"/>
+          <w:bCs w:val="0"/>
+          <w:color w:val="0C0C0C"/>
+          <w:spacing w:val="-5"/>
+        </w:rPr>
+        <w:t xml:space="preserve">Thread pooling with </w:t>
+      </w:r>
+      <w:proofErr w:type="spellStart"/>
+      <w:r>
+        <w:rPr>
+          <w:rFonts w:ascii="Arial" w:hAnsi="Arial" w:cs="Arial"/>
+          <w:b w:val="0"/>
+          <w:bCs w:val="0"/>
+          <w:color w:val="0C0C0C"/>
+          <w:spacing w:val="-5"/>
+        </w:rPr>
+        <w:t>ForkJoinPool</w:t>
+      </w:r>
+      <w:proofErr w:type="spellEnd"/>
+    </w:p>
+    <w:p>
+      <w:pPr>
+        <w:pStyle w:val="NormalWeb"/>
+        <w:shd w:val="clear" w:color="auto" w:fill="FFFFFF"/>
+        <w:spacing w:before="0" w:beforeAutospacing="0" w:after="600" w:afterAutospacing="0"/>
+        <w:rPr>
+          <w:rFonts w:ascii="Arial" w:hAnsi="Arial" w:cs="Arial"/>
+          <w:color w:val="0C0C0C"/>
+          <w:spacing w:val="-2"/>
+          <w:sz w:val="27"/>
+          <w:szCs w:val="27"/>
+        </w:rPr>
+      </w:pPr>
+      <w:r>
+        <w:rPr>
+          <w:rFonts w:ascii="Arial" w:hAnsi="Arial" w:cs="Arial"/>
+          <w:color w:val="0C0C0C"/>
+          <w:spacing w:val="-2"/>
+          <w:sz w:val="27"/>
+          <w:szCs w:val="27"/>
+        </w:rPr>
+        <w:t>The </w:t>
+      </w:r>
+      <w:proofErr w:type="spellStart"/>
+      <w:r>
+        <w:rPr>
+          <w:rStyle w:val="HTMLCode"/>
+          <w:color w:val="0000CC"/>
+          <w:spacing w:val="24"/>
+        </w:rPr>
+        <w:t>ForkJoinPool</w:t>
+      </w:r>
+      <w:proofErr w:type="spellEnd"/>
+      <w:r>
+        <w:rPr>
+          <w:rFonts w:ascii="Arial" w:hAnsi="Arial" w:cs="Arial"/>
+          <w:color w:val="0C0C0C"/>
+          <w:spacing w:val="-2"/>
+          <w:sz w:val="27"/>
+          <w:szCs w:val="27"/>
+        </w:rPr>
+        <w:t> class stores </w:t>
+      </w:r>
+      <w:r>
+        <w:rPr>
+          <w:rStyle w:val="Emphasis"/>
+          <w:rFonts w:ascii="Arial" w:hAnsi="Arial" w:cs="Arial"/>
+          <w:color w:val="0C0C0C"/>
+          <w:spacing w:val="-2"/>
+          <w:sz w:val="27"/>
+          <w:szCs w:val="27"/>
+        </w:rPr>
+        <w:t>workers</w:t>
+      </w:r>
+      <w:r>
+        <w:rPr>
+          <w:rFonts w:ascii="Arial" w:hAnsi="Arial" w:cs="Arial"/>
+          <w:color w:val="0C0C0C"/>
+          <w:spacing w:val="-2"/>
+          <w:sz w:val="27"/>
+          <w:szCs w:val="27"/>
+        </w:rPr>
+        <w:t>, which are processes being run on each CPU core from the machine. Each of those processes is stored in a </w:t>
+      </w:r>
+      <w:r>
+        <w:rPr>
+          <w:rStyle w:val="Emphasis"/>
+          <w:rFonts w:ascii="Arial" w:hAnsi="Arial" w:cs="Arial"/>
+          <w:color w:val="0C0C0C"/>
+          <w:spacing w:val="-2"/>
+          <w:sz w:val="27"/>
+          <w:szCs w:val="27"/>
+        </w:rPr>
+        <w:t>deque</w:t>
+      </w:r>
+      <w:r>
+        <w:rPr>
+          <w:rFonts w:ascii="Arial" w:hAnsi="Arial" w:cs="Arial"/>
+          <w:color w:val="0C0C0C"/>
+          <w:spacing w:val="-2"/>
+          <w:sz w:val="27"/>
+          <w:szCs w:val="27"/>
+        </w:rPr>
+        <w:t>, which stands for double-ended queue. As soon as a worker thread runs out of tasks, it begins stealing tasks from other workers.</w:t>
+      </w:r>
+    </w:p>
+    <w:p>
+      <w:pPr>
+        <w:pStyle w:val="NormalWeb"/>
+        <w:shd w:val="clear" w:color="auto" w:fill="FFFFFF"/>
+        <w:spacing w:before="600" w:beforeAutospacing="0" w:after="600" w:afterAutospacing="0"/>
+        <w:rPr>
+          <w:rFonts w:ascii="Arial" w:hAnsi="Arial" w:cs="Arial"/>
+          <w:color w:val="0C0C0C"/>
+          <w:spacing w:val="-2"/>
+          <w:sz w:val="27"/>
+          <w:szCs w:val="27"/>
+        </w:rPr>
+      </w:pPr>
+      <w:r>
+        <w:rPr>
+          <w:rFonts w:ascii="Arial" w:hAnsi="Arial" w:cs="Arial"/>
+          <w:color w:val="0C0C0C"/>
+          <w:spacing w:val="-2"/>
+          <w:sz w:val="27"/>
+          <w:szCs w:val="27"/>
+        </w:rPr>
+        <w:t xml:space="preserve">First, there will be the process of </w:t>
+      </w:r>
+      <w:proofErr w:type="spellStart"/>
+      <w:r>
+        <w:rPr>
+          <w:rFonts w:ascii="Arial" w:hAnsi="Arial" w:cs="Arial"/>
+          <w:color w:val="0C0C0C"/>
+          <w:spacing w:val="-2"/>
+          <w:sz w:val="27"/>
+          <w:szCs w:val="27"/>
+        </w:rPr>
+        <w:t>forking</w:t>
+      </w:r>
+      <w:proofErr w:type="spellEnd"/>
+      <w:r>
+        <w:rPr>
+          <w:rFonts w:ascii="Arial" w:hAnsi="Arial" w:cs="Arial"/>
+          <w:color w:val="0C0C0C"/>
+          <w:spacing w:val="-2"/>
+          <w:sz w:val="27"/>
+          <w:szCs w:val="27"/>
+        </w:rPr>
+        <w:t xml:space="preserve"> the task; this means that a big task will be broken down into smaller tasks that can be executed in parallel. Once all subtasks are completed, they are rejoined. The </w:t>
+      </w:r>
+      <w:proofErr w:type="spellStart"/>
+      <w:r>
+        <w:rPr>
+          <w:rStyle w:val="HTMLCode"/>
+          <w:color w:val="0000CC"/>
+          <w:spacing w:val="24"/>
+        </w:rPr>
+        <w:t>ForkJoinPool</w:t>
+      </w:r>
+      <w:proofErr w:type="spellEnd"/>
+      <w:r>
+        <w:rPr>
+          <w:rFonts w:ascii="Arial" w:hAnsi="Arial" w:cs="Arial"/>
+          <w:color w:val="0C0C0C"/>
+          <w:spacing w:val="-2"/>
+          <w:sz w:val="27"/>
+          <w:szCs w:val="27"/>
+        </w:rPr>
+        <w:t> class then provides one result, as shown in Figure 1.</w:t>
+      </w:r>
+    </w:p>
+    <w:p>
+      <w:pPr>
+        <w:shd w:val="clear" w:color="auto" w:fill="FFFFFF"/>
+        <w:rPr>
+          <w:rFonts w:ascii="Arial" w:hAnsi="Arial" w:cs="Arial"/>
+          <w:color w:val="000000"/>
+          <w:spacing w:val="-3"/>
+          <w:sz w:val="27"/>
+          <w:szCs w:val="27"/>
+        </w:rPr>
+      </w:pPr>
+      <w:r>
+        <w:rPr>
+          <w:rFonts w:ascii="Arial" w:hAnsi="Arial" w:cs="Arial"/>
+          <w:noProof/>
+          <w:color w:val="000000"/>
+          <w:spacing w:val="-3"/>
+          <w:sz w:val="27"/>
+          <w:szCs w:val="27"/>
+        </w:rPr>
+        <w:drawing>
+          <wp:inline distT="0" distB="0" distL="0" distR="0" wp14:anchorId="4AA981BE" wp14:editId="52608E1A">
+            <wp:extent cx="3502660" cy="2965580"/>
+            <wp:effectExtent l="0" t="0" r="2540" b="6350"/>
+            <wp:docPr id="1827271455" name="Picture 1" descr="A diagram of ForkJoinPool in Java."/>
+            <wp:cNvGraphicFramePr>
+              <a:graphicFrameLocks xmlns:a="http://schemas.openxmlformats.org/drawingml/2006/main" noChangeAspect="1"/>
+            </wp:cNvGraphicFramePr>
+            <a:graphic xmlns:a="http://schemas.openxmlformats.org/drawingml/2006/main">
+              <a:graphicData uri="http://schemas.openxmlformats.org/drawingml/2006/picture">
+                <pic:pic xmlns:pic="http://schemas.openxmlformats.org/drawingml/2006/picture">
+                  <pic:nvPicPr>
+                    <pic:cNvPr id="0" name="Picture 2" descr="A diagram of ForkJoinPool in Java."/>
+                    <pic:cNvPicPr>
+                      <a:picLocks noChangeAspect="1" noChangeArrowheads="1"/>
+                    </pic:cNvPicPr>
+                  </pic:nvPicPr>
+                  <pic:blipFill>
+                    <a:blip r:embed="rId12" cstate="print">
+                      <a:extLst>
+                        <a:ext uri="{28A0092B-C50C-407E-A947-70E740481C1C}">
+                          <a14:useLocalDpi xmlns:a14="http://schemas.microsoft.com/office/drawing/2010/main" val="0"/>
+                        </a:ext>
+                      </a:extLst>
+                    </a:blip>
+                    <a:srcRect/>
+                    <a:stretch>
+                      <a:fillRect/>
+                    </a:stretch>
+                  </pic:blipFill>
+                  <pic:spPr bwMode="auto">
+                    <a:xfrm>
+                      <a:off x="0" y="0"/>
+                      <a:ext cx="3508804" cy="2970782"/>
+                    </a:xfrm>
+                    <a:prstGeom prst="rect">
+                      <a:avLst/>
+                    </a:prstGeom>
+                    <a:noFill/>
+                    <a:ln>
+                      <a:noFill/>
+                    </a:ln>
+                  </pic:spPr>
+                </pic:pic>
+              </a:graphicData>
+            </a:graphic>
+          </wp:inline>
+        </w:drawing>
+      </w:r>
+      <w:r>
+        <w:rPr>
+          <w:rFonts w:ascii="Arial" w:hAnsi="Arial" w:cs="Arial"/>
+          <w:caps/>
+          <w:color w:val="4D4D4D"/>
+          <w:spacing w:val="19"/>
+        </w:rPr>
+        <w:t>IDG</w:t>
+      </w:r>
+    </w:p>
+    <w:p>
+      <w:pPr>
+        <w:pStyle w:val="NormalWeb"/>
+        <w:shd w:val="clear" w:color="auto" w:fill="FFFFFF"/>
+        <w:spacing w:before="0" w:beforeAutospacing="0" w:after="90" w:afterAutospacing="0"/>
+        <w:rPr>
+          <w:rFonts w:ascii="Arial" w:hAnsi="Arial" w:cs="Arial"/>
+          <w:caps/>
+          <w:color w:val="4D4D4D"/>
+          <w:spacing w:val="19"/>
+          <w:sz w:val="27"/>
+          <w:szCs w:val="27"/>
+        </w:rPr>
+      </w:pPr>
+      <w:r>
+        <w:rPr>
+          <w:rFonts w:ascii="Arial" w:hAnsi="Arial" w:cs="Arial"/>
+          <w:caps/>
+          <w:color w:val="4D4D4D"/>
+          <w:spacing w:val="19"/>
+          <w:sz w:val="27"/>
+          <w:szCs w:val="27"/>
+        </w:rPr>
+        <w:t>FIGURE 1. FORKJOINPOOL IN ACTION</w:t>
+      </w:r>
+    </w:p>
+    <w:p>
+      <w:pPr>
+        <w:pStyle w:val="NormalWeb"/>
+        <w:shd w:val="clear" w:color="auto" w:fill="FFFFFF"/>
+        <w:spacing w:before="600" w:beforeAutospacing="0" w:after="600" w:afterAutospacing="0"/>
+        <w:rPr>
+          <w:rFonts w:ascii="Arial" w:hAnsi="Arial" w:cs="Arial"/>
+          <w:color w:val="0C0C0C"/>
+          <w:spacing w:val="-2"/>
+          <w:sz w:val="27"/>
+          <w:szCs w:val="27"/>
+        </w:rPr>
+      </w:pPr>
+      <w:r>
+        <w:rPr>
+          <w:rFonts w:ascii="Arial" w:hAnsi="Arial" w:cs="Arial"/>
+          <w:color w:val="0C0C0C"/>
+          <w:spacing w:val="-2"/>
+          <w:sz w:val="27"/>
+          <w:szCs w:val="27"/>
+        </w:rPr>
+        <w:lastRenderedPageBreak/>
+        <w:t>When the task is submitted in a </w:t>
+      </w:r>
+      <w:proofErr w:type="spellStart"/>
+      <w:r>
+        <w:rPr>
+          <w:rStyle w:val="HTMLCode"/>
+          <w:color w:val="0000CC"/>
+          <w:spacing w:val="24"/>
+        </w:rPr>
+        <w:t>ForkJoinPool</w:t>
+      </w:r>
+      <w:proofErr w:type="spellEnd"/>
+      <w:r>
+        <w:rPr>
+          <w:rFonts w:ascii="Arial" w:hAnsi="Arial" w:cs="Arial"/>
+          <w:color w:val="0C0C0C"/>
+          <w:spacing w:val="-2"/>
+          <w:sz w:val="27"/>
+          <w:szCs w:val="27"/>
+        </w:rPr>
+        <w:t>, the process will be divided into smaller processes and pushed to a shared queue.</w:t>
+      </w:r>
+    </w:p>
+    <w:p>
+      <w:pPr>
+        <w:pStyle w:val="NormalWeb"/>
+        <w:shd w:val="clear" w:color="auto" w:fill="FFFFFF"/>
+        <w:spacing w:before="600" w:beforeAutospacing="0" w:after="600" w:afterAutospacing="0"/>
+        <w:rPr>
+          <w:rFonts w:ascii="Arial" w:hAnsi="Arial" w:cs="Arial"/>
+          <w:color w:val="0C0C0C"/>
+          <w:spacing w:val="-2"/>
+          <w:sz w:val="27"/>
+          <w:szCs w:val="27"/>
+        </w:rPr>
+      </w:pPr>
+      <w:r>
+        <w:rPr>
+          <w:rFonts w:ascii="Arial" w:hAnsi="Arial" w:cs="Arial"/>
+          <w:color w:val="0C0C0C"/>
+          <w:spacing w:val="-2"/>
+          <w:sz w:val="27"/>
+          <w:szCs w:val="27"/>
+        </w:rPr>
+        <w:t>Once the </w:t>
+      </w:r>
+      <w:proofErr w:type="gramStart"/>
+      <w:r>
+        <w:rPr>
+          <w:rStyle w:val="HTMLCode"/>
+          <w:color w:val="0000CC"/>
+          <w:spacing w:val="24"/>
+        </w:rPr>
+        <w:t>fork(</w:t>
+      </w:r>
+      <w:proofErr w:type="gramEnd"/>
+      <w:r>
+        <w:rPr>
+          <w:rStyle w:val="HTMLCode"/>
+          <w:color w:val="0000CC"/>
+          <w:spacing w:val="24"/>
+        </w:rPr>
+        <w:t>)</w:t>
+      </w:r>
+      <w:r>
+        <w:rPr>
+          <w:rFonts w:ascii="Arial" w:hAnsi="Arial" w:cs="Arial"/>
+          <w:color w:val="0C0C0C"/>
+          <w:spacing w:val="-2"/>
+          <w:sz w:val="27"/>
+          <w:szCs w:val="27"/>
+        </w:rPr>
+        <w:t> method is invoked, tasks are invoked in parallel until the base condition is true. Once processing is forked, the </w:t>
+      </w:r>
+      <w:proofErr w:type="gramStart"/>
+      <w:r>
+        <w:rPr>
+          <w:rStyle w:val="HTMLCode"/>
+          <w:color w:val="0000CC"/>
+          <w:spacing w:val="24"/>
+        </w:rPr>
+        <w:t>join(</w:t>
+      </w:r>
+      <w:proofErr w:type="gramEnd"/>
+      <w:r>
+        <w:rPr>
+          <w:rStyle w:val="HTMLCode"/>
+          <w:color w:val="0000CC"/>
+          <w:spacing w:val="24"/>
+        </w:rPr>
+        <w:t>)</w:t>
+      </w:r>
+      <w:r>
+        <w:rPr>
+          <w:rFonts w:ascii="Arial" w:hAnsi="Arial" w:cs="Arial"/>
+          <w:color w:val="0C0C0C"/>
+          <w:spacing w:val="-2"/>
+          <w:sz w:val="27"/>
+          <w:szCs w:val="27"/>
+        </w:rPr>
+        <w:t> method ensures that threads wait for each other until the process has been finalized.</w:t>
+      </w:r>
+    </w:p>
+    <w:p>
+      <w:pPr>
+        <w:pStyle w:val="NormalWeb"/>
+        <w:shd w:val="clear" w:color="auto" w:fill="FFFFFF"/>
+        <w:spacing w:before="600" w:beforeAutospacing="0" w:after="600" w:afterAutospacing="0"/>
+        <w:rPr>
+          <w:rFonts w:ascii="Arial" w:hAnsi="Arial" w:cs="Arial"/>
+          <w:color w:val="0C0C0C"/>
+          <w:spacing w:val="-2"/>
+          <w:sz w:val="27"/>
+          <w:szCs w:val="27"/>
+        </w:rPr>
+      </w:pPr>
+      <w:r>
+        <w:rPr>
+          <w:rFonts w:ascii="Arial" w:hAnsi="Arial" w:cs="Arial"/>
+          <w:color w:val="0C0C0C"/>
+          <w:spacing w:val="-2"/>
+          <w:sz w:val="27"/>
+          <w:szCs w:val="27"/>
+        </w:rPr>
         <w:t>All the tasks initially will be submitted to a main queue, and this main queue will push tasks to the worker threads. Notice that tasks are inserted using the LIFO (last-in, first-out) strategy which is the same as the </w:t>
       </w:r>
-      <w:hyperlink r:id="rId11" w:history="1">
+      <w:hyperlink r:id="rId13" w:history="1">
         <w:r>
           <w:rPr>
             <w:rStyle w:val="Hyperlink"/>
@@ -9520,310 +10116,6 @@
                 <pic:pic xmlns:pic="http://schemas.openxmlformats.org/drawingml/2006/picture">
                   <pic:nvPicPr>
                     <pic:cNvPr id="0" name="Picture 9" descr="ForkJoinPool Deque diagram"/>
-                    <pic:cNvPicPr>
-                      <a:picLocks noChangeAspect="1" noChangeArrowheads="1"/>
-                    </pic:cNvPicPr>
-                  </pic:nvPicPr>
-                  <pic:blipFill>
-                    <a:blip r:embed="rId12">
-                      <a:extLst>
-                        <a:ext uri="{28A0092B-C50C-407E-A947-70E740481C1C}">
-                          <a14:useLocalDpi xmlns:a14="http://schemas.microsoft.com/office/drawing/2010/main" val="0"/>
-                        </a:ext>
-                      </a:extLst>
-                    </a:blip>
-                    <a:srcRect/>
-                    <a:stretch>
-                      <a:fillRect/>
-                    </a:stretch>
-                  </pic:blipFill>
-                  <pic:spPr bwMode="auto">
-                    <a:xfrm>
-                      <a:off x="0" y="0"/>
-                      <a:ext cx="5731510" cy="5731510"/>
-                    </a:xfrm>
-                    <a:prstGeom prst="rect">
-                      <a:avLst/>
-                    </a:prstGeom>
-                    <a:noFill/>
-                    <a:ln>
-                      <a:noFill/>
-                    </a:ln>
-                  </pic:spPr>
-                </pic:pic>
-              </a:graphicData>
-            </a:graphic>
-          </wp:inline>
-        </w:drawing>
-      </w:r>
-      <w:r>
-        <w:rPr>
-          <w:rFonts w:ascii="Arial" w:hAnsi="Arial" w:cs="Arial"/>
-          <w:caps/>
-          <w:color w:val="4D4D4D"/>
-          <w:spacing w:val="19"/>
-        </w:rPr>
-        <w:t>IDG</w:t>
-      </w:r>
-    </w:p>
-    <w:p>
-      <w:pPr>
-        <w:pStyle w:val="NormalWeb"/>
-        <w:shd w:val="clear" w:color="auto" w:fill="FFFFFF"/>
-        <w:spacing w:before="0" w:beforeAutospacing="0" w:after="90" w:afterAutospacing="0"/>
-        <w:rPr>
-          <w:rFonts w:ascii="Arial" w:hAnsi="Arial" w:cs="Arial"/>
-          <w:caps/>
-          <w:color w:val="4D4D4D"/>
-          <w:spacing w:val="19"/>
-          <w:sz w:val="27"/>
-          <w:szCs w:val="27"/>
-        </w:rPr>
-      </w:pPr>
-      <w:r>
-        <w:rPr>
-          <w:rFonts w:ascii="Arial" w:hAnsi="Arial" w:cs="Arial"/>
-          <w:caps/>
-          <w:color w:val="4D4D4D"/>
-          <w:spacing w:val="19"/>
-          <w:sz w:val="27"/>
-          <w:szCs w:val="27"/>
-        </w:rPr>
-        <w:t>FIGURE 2. FORKJOINPOOL USES DEQUES TO STORE TASKS</w:t>
-      </w:r>
-    </w:p>
-    <w:p>
-      <w:pPr>
-        <w:pStyle w:val="Heading2"/>
-        <w:shd w:val="clear" w:color="auto" w:fill="FFFFFF"/>
-        <w:spacing w:before="960" w:beforeAutospacing="0" w:after="240" w:afterAutospacing="0"/>
-        <w:rPr>
-          <w:rFonts w:ascii="Arial" w:hAnsi="Arial" w:cs="Arial"/>
-          <w:b w:val="0"/>
-          <w:bCs w:val="0"/>
-          <w:color w:val="0C0C0C"/>
-          <w:spacing w:val="-5"/>
-        </w:rPr>
-      </w:pPr>
-      <w:r>
-        <w:rPr>
-          <w:rFonts w:ascii="Arial" w:hAnsi="Arial" w:cs="Arial"/>
-          <w:b w:val="0"/>
-          <w:bCs w:val="0"/>
-          <w:color w:val="0C0C0C"/>
-          <w:spacing w:val="-5"/>
-        </w:rPr>
-        <w:t>The work-stealing algorithm</w:t>
-      </w:r>
-    </w:p>
-    <w:p>
-      <w:pPr>
-        <w:pStyle w:val="NormalWeb"/>
-        <w:shd w:val="clear" w:color="auto" w:fill="FFFFFF"/>
-        <w:spacing w:before="0" w:beforeAutospacing="0" w:after="600" w:afterAutospacing="0"/>
-        <w:rPr>
-          <w:rFonts w:ascii="Arial" w:hAnsi="Arial" w:cs="Arial"/>
-          <w:color w:val="0C0C0C"/>
-          <w:spacing w:val="-2"/>
-          <w:sz w:val="27"/>
-          <w:szCs w:val="27"/>
-        </w:rPr>
-      </w:pPr>
-      <w:r>
-        <w:rPr>
-          <w:rFonts w:ascii="Arial" w:hAnsi="Arial" w:cs="Arial"/>
-          <w:color w:val="0C0C0C"/>
-          <w:spacing w:val="-2"/>
-          <w:sz w:val="27"/>
-          <w:szCs w:val="27"/>
-        </w:rPr>
-        <w:t>Work-stealing in </w:t>
-      </w:r>
-      <w:proofErr w:type="spellStart"/>
-      <w:r>
-        <w:rPr>
-          <w:rStyle w:val="HTMLCode"/>
-          <w:color w:val="0000CC"/>
-          <w:spacing w:val="24"/>
-        </w:rPr>
-        <w:t>ForkJoinPool</w:t>
-      </w:r>
-      <w:proofErr w:type="spellEnd"/>
-      <w:r>
-        <w:rPr>
-          <w:rFonts w:ascii="Arial" w:hAnsi="Arial" w:cs="Arial"/>
-          <w:color w:val="0C0C0C"/>
-          <w:spacing w:val="-2"/>
-          <w:sz w:val="27"/>
-          <w:szCs w:val="27"/>
-        </w:rPr>
-        <w:t> is an effective algorithm that enables efficient use of computer resources by balancing the workload across all available threads in the pool.</w:t>
-      </w:r>
-    </w:p>
-    <w:p>
-      <w:pPr>
-        <w:pStyle w:val="NormalWeb"/>
-        <w:shd w:val="clear" w:color="auto" w:fill="FFFFFF"/>
-        <w:spacing w:before="600" w:beforeAutospacing="0" w:after="600" w:afterAutospacing="0"/>
-        <w:rPr>
-          <w:rFonts w:ascii="Arial" w:hAnsi="Arial" w:cs="Arial"/>
-          <w:color w:val="0C0C0C"/>
-          <w:spacing w:val="-2"/>
-          <w:sz w:val="27"/>
-          <w:szCs w:val="27"/>
-        </w:rPr>
-      </w:pPr>
-      <w:r>
-        <w:rPr>
-          <w:rFonts w:ascii="Arial" w:hAnsi="Arial" w:cs="Arial"/>
-          <w:color w:val="0C0C0C"/>
-          <w:spacing w:val="-2"/>
-          <w:sz w:val="27"/>
-          <w:szCs w:val="27"/>
-        </w:rPr>
-        <w:t xml:space="preserve">When a thread becomes idle, instead of remaining inactive, it will attempt to steal tasks from other threads that are still busy with their assigned work. </w:t>
-      </w:r>
-      <w:r>
-        <w:rPr>
-          <w:rFonts w:ascii="Arial" w:hAnsi="Arial" w:cs="Arial"/>
-          <w:color w:val="0C0C0C"/>
-          <w:spacing w:val="-2"/>
-          <w:sz w:val="27"/>
-          <w:szCs w:val="27"/>
-        </w:rPr>
-        <w:lastRenderedPageBreak/>
-        <w:t>This process maximizes the utilization of computing resources and ensures that no thread is overburdened while others remain idle.</w:t>
-      </w:r>
-    </w:p>
-    <w:p>
-      <w:pPr>
-        <w:pStyle w:val="NormalWeb"/>
-        <w:shd w:val="clear" w:color="auto" w:fill="FFFFFF"/>
-        <w:spacing w:before="600" w:beforeAutospacing="0" w:after="600" w:afterAutospacing="0"/>
-        <w:rPr>
-          <w:rFonts w:ascii="Arial" w:hAnsi="Arial" w:cs="Arial"/>
-          <w:color w:val="0C0C0C"/>
-          <w:spacing w:val="-2"/>
-          <w:sz w:val="27"/>
-          <w:szCs w:val="27"/>
-        </w:rPr>
-      </w:pPr>
-      <w:r>
-        <w:rPr>
-          <w:rFonts w:ascii="Arial" w:hAnsi="Arial" w:cs="Arial"/>
-          <w:color w:val="0C0C0C"/>
-          <w:spacing w:val="-2"/>
-          <w:sz w:val="27"/>
-          <w:szCs w:val="27"/>
-        </w:rPr>
-        <w:t>The key concept behind the work-stealing algorithm is that each thread has its own deque of tasks, which it executes in a LIFO order.</w:t>
-      </w:r>
-    </w:p>
-    <w:p>
-      <w:pPr>
-        <w:pStyle w:val="NormalWeb"/>
-        <w:shd w:val="clear" w:color="auto" w:fill="FFFFFF"/>
-        <w:spacing w:before="600" w:beforeAutospacing="0" w:after="600" w:afterAutospacing="0"/>
-        <w:rPr>
-          <w:rFonts w:ascii="Arial" w:hAnsi="Arial" w:cs="Arial"/>
-          <w:color w:val="0C0C0C"/>
-          <w:spacing w:val="-2"/>
-          <w:sz w:val="27"/>
-          <w:szCs w:val="27"/>
-        </w:rPr>
-      </w:pPr>
-      <w:r>
-        <w:rPr>
-          <w:rFonts w:ascii="Arial" w:hAnsi="Arial" w:cs="Arial"/>
-          <w:color w:val="0C0C0C"/>
-          <w:spacing w:val="-2"/>
-          <w:sz w:val="27"/>
-          <w:szCs w:val="27"/>
-        </w:rPr>
-        <w:t>When a thread finishes its own tasks and becomes idle, it will attempt to “steal” tasks from the end of another thread’s deque, following a FIFO strategy, the same as the </w:t>
-      </w:r>
-      <w:hyperlink r:id="rId13" w:history="1">
-        <w:r>
-          <w:rPr>
-            <w:rStyle w:val="Hyperlink"/>
-            <w:rFonts w:ascii="Arial" w:hAnsi="Arial" w:cs="Arial"/>
-            <w:color w:val="0C0C0C"/>
-            <w:spacing w:val="-2"/>
-            <w:sz w:val="27"/>
-            <w:szCs w:val="27"/>
-          </w:rPr>
-          <w:t>queue data structure</w:t>
-        </w:r>
-      </w:hyperlink>
-      <w:r>
-        <w:rPr>
-          <w:rFonts w:ascii="Arial" w:hAnsi="Arial" w:cs="Arial"/>
-          <w:color w:val="0C0C0C"/>
-          <w:spacing w:val="-2"/>
-          <w:sz w:val="27"/>
-          <w:szCs w:val="27"/>
-        </w:rPr>
-        <w:t>. This allows the idle thread to pick up the tasks that have waited for the longest time, reducing the overall waiting time and increasing throughput.</w:t>
-      </w:r>
-    </w:p>
-    <w:p>
-      <w:pPr>
-        <w:pStyle w:val="NormalWeb"/>
-        <w:shd w:val="clear" w:color="auto" w:fill="FFFFFF"/>
-        <w:spacing w:before="600" w:beforeAutospacing="0" w:after="600" w:afterAutospacing="0"/>
-        <w:rPr>
-          <w:rFonts w:ascii="Arial" w:hAnsi="Arial" w:cs="Arial"/>
-          <w:color w:val="0C0C0C"/>
-          <w:spacing w:val="-2"/>
-          <w:sz w:val="27"/>
-          <w:szCs w:val="27"/>
-        </w:rPr>
-      </w:pPr>
-      <w:r>
-        <w:rPr>
-          <w:rFonts w:ascii="Arial" w:hAnsi="Arial" w:cs="Arial"/>
-          <w:color w:val="0C0C0C"/>
-          <w:spacing w:val="-2"/>
-          <w:sz w:val="27"/>
-          <w:szCs w:val="27"/>
-        </w:rPr>
-        <w:t>In the following diagram, Thread 2 steals a task from Thread 1 by polling the last element from Thread 1’s deque, and then executes the task. The stolen task is typically the oldest one in the deque, which ensures that the workload is evenly distributed among all threads in the pool.</w:t>
-      </w:r>
-    </w:p>
-    <w:p>
-      <w:pPr>
-        <w:shd w:val="clear" w:color="auto" w:fill="FFFFFF"/>
-        <w:rPr>
-          <w:rFonts w:ascii="Arial" w:hAnsi="Arial" w:cs="Arial"/>
-          <w:color w:val="000000"/>
-          <w:spacing w:val="-3"/>
-          <w:sz w:val="27"/>
-          <w:szCs w:val="27"/>
-        </w:rPr>
-      </w:pPr>
-      <w:r>
-        <w:rPr>
-          <w:rFonts w:ascii="Arial" w:hAnsi="Arial" w:cs="Arial"/>
-          <w:noProof/>
-          <w:color w:val="000000"/>
-          <w:spacing w:val="-3"/>
-          <w:sz w:val="27"/>
-          <w:szCs w:val="27"/>
-        </w:rPr>
-        <w:lastRenderedPageBreak/>
-        <w:drawing>
-          <wp:inline distT="0" distB="0" distL="0" distR="0" wp14:anchorId="4EA983D1" wp14:editId="74C4F074">
-            <wp:extent cx="5731510" cy="5731510"/>
-            <wp:effectExtent l="0" t="0" r="2540" b="2540"/>
-            <wp:docPr id="1127434252" name="Picture 5" descr="Threads in ForkJoinPool"/>
-            <wp:cNvGraphicFramePr>
-              <a:graphicFrameLocks xmlns:a="http://schemas.openxmlformats.org/drawingml/2006/main" noChangeAspect="1"/>
-            </wp:cNvGraphicFramePr>
-            <a:graphic xmlns:a="http://schemas.openxmlformats.org/drawingml/2006/main">
-              <a:graphicData uri="http://schemas.openxmlformats.org/drawingml/2006/picture">
-                <pic:pic xmlns:pic="http://schemas.openxmlformats.org/drawingml/2006/picture">
-                  <pic:nvPicPr>
-                    <pic:cNvPr id="0" name="Picture 10" descr="Threads in ForkJoinPool"/>
                     <pic:cNvPicPr>
                       <a:picLocks noChangeAspect="1" noChangeArrowheads="1"/>
                     </pic:cNvPicPr>
@@ -9893,6 +10185,310 @@
           <w:sz w:val="27"/>
           <w:szCs w:val="27"/>
         </w:rPr>
+        <w:t>FIGURE 2. FORKJOINPOOL USES DEQUES TO STORE TASKS</w:t>
+      </w:r>
+    </w:p>
+    <w:p>
+      <w:pPr>
+        <w:pStyle w:val="Heading2"/>
+        <w:shd w:val="clear" w:color="auto" w:fill="FFFFFF"/>
+        <w:spacing w:before="960" w:beforeAutospacing="0" w:after="240" w:afterAutospacing="0"/>
+        <w:rPr>
+          <w:rFonts w:ascii="Arial" w:hAnsi="Arial" w:cs="Arial"/>
+          <w:b w:val="0"/>
+          <w:bCs w:val="0"/>
+          <w:color w:val="0C0C0C"/>
+          <w:spacing w:val="-5"/>
+        </w:rPr>
+      </w:pPr>
+      <w:r>
+        <w:rPr>
+          <w:rFonts w:ascii="Arial" w:hAnsi="Arial" w:cs="Arial"/>
+          <w:b w:val="0"/>
+          <w:bCs w:val="0"/>
+          <w:color w:val="0C0C0C"/>
+          <w:spacing w:val="-5"/>
+        </w:rPr>
+        <w:t>The work-stealing algorithm</w:t>
+      </w:r>
+    </w:p>
+    <w:p>
+      <w:pPr>
+        <w:pStyle w:val="NormalWeb"/>
+        <w:shd w:val="clear" w:color="auto" w:fill="FFFFFF"/>
+        <w:spacing w:before="0" w:beforeAutospacing="0" w:after="600" w:afterAutospacing="0"/>
+        <w:rPr>
+          <w:rFonts w:ascii="Arial" w:hAnsi="Arial" w:cs="Arial"/>
+          <w:color w:val="0C0C0C"/>
+          <w:spacing w:val="-2"/>
+          <w:sz w:val="27"/>
+          <w:szCs w:val="27"/>
+        </w:rPr>
+      </w:pPr>
+      <w:r>
+        <w:rPr>
+          <w:rFonts w:ascii="Arial" w:hAnsi="Arial" w:cs="Arial"/>
+          <w:color w:val="0C0C0C"/>
+          <w:spacing w:val="-2"/>
+          <w:sz w:val="27"/>
+          <w:szCs w:val="27"/>
+        </w:rPr>
+        <w:t>Work-stealing in </w:t>
+      </w:r>
+      <w:proofErr w:type="spellStart"/>
+      <w:r>
+        <w:rPr>
+          <w:rStyle w:val="HTMLCode"/>
+          <w:color w:val="0000CC"/>
+          <w:spacing w:val="24"/>
+        </w:rPr>
+        <w:t>ForkJoinPool</w:t>
+      </w:r>
+      <w:proofErr w:type="spellEnd"/>
+      <w:r>
+        <w:rPr>
+          <w:rFonts w:ascii="Arial" w:hAnsi="Arial" w:cs="Arial"/>
+          <w:color w:val="0C0C0C"/>
+          <w:spacing w:val="-2"/>
+          <w:sz w:val="27"/>
+          <w:szCs w:val="27"/>
+        </w:rPr>
+        <w:t> is an effective algorithm that enables efficient use of computer resources by balancing the workload across all available threads in the pool.</w:t>
+      </w:r>
+    </w:p>
+    <w:p>
+      <w:pPr>
+        <w:pStyle w:val="NormalWeb"/>
+        <w:shd w:val="clear" w:color="auto" w:fill="FFFFFF"/>
+        <w:spacing w:before="600" w:beforeAutospacing="0" w:after="600" w:afterAutospacing="0"/>
+        <w:rPr>
+          <w:rFonts w:ascii="Arial" w:hAnsi="Arial" w:cs="Arial"/>
+          <w:color w:val="0C0C0C"/>
+          <w:spacing w:val="-2"/>
+          <w:sz w:val="27"/>
+          <w:szCs w:val="27"/>
+        </w:rPr>
+      </w:pPr>
+      <w:r>
+        <w:rPr>
+          <w:rFonts w:ascii="Arial" w:hAnsi="Arial" w:cs="Arial"/>
+          <w:color w:val="0C0C0C"/>
+          <w:spacing w:val="-2"/>
+          <w:sz w:val="27"/>
+          <w:szCs w:val="27"/>
+        </w:rPr>
+        <w:t xml:space="preserve">When a thread becomes idle, instead of remaining inactive, it will attempt to steal tasks from other threads that are still busy with their assigned work. </w:t>
+      </w:r>
+      <w:r>
+        <w:rPr>
+          <w:rFonts w:ascii="Arial" w:hAnsi="Arial" w:cs="Arial"/>
+          <w:color w:val="0C0C0C"/>
+          <w:spacing w:val="-2"/>
+          <w:sz w:val="27"/>
+          <w:szCs w:val="27"/>
+        </w:rPr>
+        <w:lastRenderedPageBreak/>
+        <w:t>This process maximizes the utilization of computing resources and ensures that no thread is overburdened while others remain idle.</w:t>
+      </w:r>
+    </w:p>
+    <w:p>
+      <w:pPr>
+        <w:pStyle w:val="NormalWeb"/>
+        <w:shd w:val="clear" w:color="auto" w:fill="FFFFFF"/>
+        <w:spacing w:before="600" w:beforeAutospacing="0" w:after="600" w:afterAutospacing="0"/>
+        <w:rPr>
+          <w:rFonts w:ascii="Arial" w:hAnsi="Arial" w:cs="Arial"/>
+          <w:color w:val="0C0C0C"/>
+          <w:spacing w:val="-2"/>
+          <w:sz w:val="27"/>
+          <w:szCs w:val="27"/>
+        </w:rPr>
+      </w:pPr>
+      <w:r>
+        <w:rPr>
+          <w:rFonts w:ascii="Arial" w:hAnsi="Arial" w:cs="Arial"/>
+          <w:color w:val="0C0C0C"/>
+          <w:spacing w:val="-2"/>
+          <w:sz w:val="27"/>
+          <w:szCs w:val="27"/>
+        </w:rPr>
+        <w:t>The key concept behind the work-stealing algorithm is that each thread has its own deque of tasks, which it executes in a LIFO order.</w:t>
+      </w:r>
+    </w:p>
+    <w:p>
+      <w:pPr>
+        <w:pStyle w:val="NormalWeb"/>
+        <w:shd w:val="clear" w:color="auto" w:fill="FFFFFF"/>
+        <w:spacing w:before="600" w:beforeAutospacing="0" w:after="600" w:afterAutospacing="0"/>
+        <w:rPr>
+          <w:rFonts w:ascii="Arial" w:hAnsi="Arial" w:cs="Arial"/>
+          <w:color w:val="0C0C0C"/>
+          <w:spacing w:val="-2"/>
+          <w:sz w:val="27"/>
+          <w:szCs w:val="27"/>
+        </w:rPr>
+      </w:pPr>
+      <w:r>
+        <w:rPr>
+          <w:rFonts w:ascii="Arial" w:hAnsi="Arial" w:cs="Arial"/>
+          <w:color w:val="0C0C0C"/>
+          <w:spacing w:val="-2"/>
+          <w:sz w:val="27"/>
+          <w:szCs w:val="27"/>
+        </w:rPr>
+        <w:t>When a thread finishes its own tasks and becomes idle, it will attempt to “steal” tasks from the end of another thread’s deque, following a FIFO strategy, the same as the </w:t>
+      </w:r>
+      <w:hyperlink r:id="rId15" w:history="1">
+        <w:r>
+          <w:rPr>
+            <w:rStyle w:val="Hyperlink"/>
+            <w:rFonts w:ascii="Arial" w:hAnsi="Arial" w:cs="Arial"/>
+            <w:color w:val="0C0C0C"/>
+            <w:spacing w:val="-2"/>
+            <w:sz w:val="27"/>
+            <w:szCs w:val="27"/>
+          </w:rPr>
+          <w:t>queue data structure</w:t>
+        </w:r>
+      </w:hyperlink>
+      <w:r>
+        <w:rPr>
+          <w:rFonts w:ascii="Arial" w:hAnsi="Arial" w:cs="Arial"/>
+          <w:color w:val="0C0C0C"/>
+          <w:spacing w:val="-2"/>
+          <w:sz w:val="27"/>
+          <w:szCs w:val="27"/>
+        </w:rPr>
+        <w:t>. This allows the idle thread to pick up the tasks that have waited for the longest time, reducing the overall waiting time and increasing throughput.</w:t>
+      </w:r>
+    </w:p>
+    <w:p>
+      <w:pPr>
+        <w:pStyle w:val="NormalWeb"/>
+        <w:shd w:val="clear" w:color="auto" w:fill="FFFFFF"/>
+        <w:spacing w:before="600" w:beforeAutospacing="0" w:after="600" w:afterAutospacing="0"/>
+        <w:rPr>
+          <w:rFonts w:ascii="Arial" w:hAnsi="Arial" w:cs="Arial"/>
+          <w:color w:val="0C0C0C"/>
+          <w:spacing w:val="-2"/>
+          <w:sz w:val="27"/>
+          <w:szCs w:val="27"/>
+        </w:rPr>
+      </w:pPr>
+      <w:r>
+        <w:rPr>
+          <w:rFonts w:ascii="Arial" w:hAnsi="Arial" w:cs="Arial"/>
+          <w:color w:val="0C0C0C"/>
+          <w:spacing w:val="-2"/>
+          <w:sz w:val="27"/>
+          <w:szCs w:val="27"/>
+        </w:rPr>
+        <w:t>In the following diagram, Thread 2 steals a task from Thread 1 by polling the last element from Thread 1’s deque, and then executes the task. The stolen task is typically the oldest one in the deque, which ensures that the workload is evenly distributed among all threads in the pool.</w:t>
+      </w:r>
+    </w:p>
+    <w:p>
+      <w:pPr>
+        <w:shd w:val="clear" w:color="auto" w:fill="FFFFFF"/>
+        <w:rPr>
+          <w:rFonts w:ascii="Arial" w:hAnsi="Arial" w:cs="Arial"/>
+          <w:color w:val="000000"/>
+          <w:spacing w:val="-3"/>
+          <w:sz w:val="27"/>
+          <w:szCs w:val="27"/>
+        </w:rPr>
+      </w:pPr>
+      <w:r>
+        <w:rPr>
+          <w:rFonts w:ascii="Arial" w:hAnsi="Arial" w:cs="Arial"/>
+          <w:noProof/>
+          <w:color w:val="000000"/>
+          <w:spacing w:val="-3"/>
+          <w:sz w:val="27"/>
+          <w:szCs w:val="27"/>
+        </w:rPr>
+        <w:lastRenderedPageBreak/>
+        <w:drawing>
+          <wp:inline distT="0" distB="0" distL="0" distR="0" wp14:anchorId="4EA983D1" wp14:editId="74C4F074">
+            <wp:extent cx="5731510" cy="5731510"/>
+            <wp:effectExtent l="0" t="0" r="2540" b="2540"/>
+            <wp:docPr id="1127434252" name="Picture 5" descr="Threads in ForkJoinPool"/>
+            <wp:cNvGraphicFramePr>
+              <a:graphicFrameLocks xmlns:a="http://schemas.openxmlformats.org/drawingml/2006/main" noChangeAspect="1"/>
+            </wp:cNvGraphicFramePr>
+            <a:graphic xmlns:a="http://schemas.openxmlformats.org/drawingml/2006/main">
+              <a:graphicData uri="http://schemas.openxmlformats.org/drawingml/2006/picture">
+                <pic:pic xmlns:pic="http://schemas.openxmlformats.org/drawingml/2006/picture">
+                  <pic:nvPicPr>
+                    <pic:cNvPr id="0" name="Picture 10" descr="Threads in ForkJoinPool"/>
+                    <pic:cNvPicPr>
+                      <a:picLocks noChangeAspect="1" noChangeArrowheads="1"/>
+                    </pic:cNvPicPr>
+                  </pic:nvPicPr>
+                  <pic:blipFill>
+                    <a:blip r:embed="rId16">
+                      <a:extLst>
+                        <a:ext uri="{28A0092B-C50C-407E-A947-70E740481C1C}">
+                          <a14:useLocalDpi xmlns:a14="http://schemas.microsoft.com/office/drawing/2010/main" val="0"/>
+                        </a:ext>
+                      </a:extLst>
+                    </a:blip>
+                    <a:srcRect/>
+                    <a:stretch>
+                      <a:fillRect/>
+                    </a:stretch>
+                  </pic:blipFill>
+                  <pic:spPr bwMode="auto">
+                    <a:xfrm>
+                      <a:off x="0" y="0"/>
+                      <a:ext cx="5731510" cy="5731510"/>
+                    </a:xfrm>
+                    <a:prstGeom prst="rect">
+                      <a:avLst/>
+                    </a:prstGeom>
+                    <a:noFill/>
+                    <a:ln>
+                      <a:noFill/>
+                    </a:ln>
+                  </pic:spPr>
+                </pic:pic>
+              </a:graphicData>
+            </a:graphic>
+          </wp:inline>
+        </w:drawing>
+      </w:r>
+      <w:r>
+        <w:rPr>
+          <w:rFonts w:ascii="Arial" w:hAnsi="Arial" w:cs="Arial"/>
+          <w:caps/>
+          <w:color w:val="4D4D4D"/>
+          <w:spacing w:val="19"/>
+        </w:rPr>
+        <w:t>IDG</w:t>
+      </w:r>
+    </w:p>
+    <w:p>
+      <w:pPr>
+        <w:pStyle w:val="NormalWeb"/>
+        <w:shd w:val="clear" w:color="auto" w:fill="FFFFFF"/>
+        <w:spacing w:before="0" w:beforeAutospacing="0" w:after="90" w:afterAutospacing="0"/>
+        <w:rPr>
+          <w:rFonts w:ascii="Arial" w:hAnsi="Arial" w:cs="Arial"/>
+          <w:caps/>
+          <w:color w:val="4D4D4D"/>
+          <w:spacing w:val="19"/>
+          <w:sz w:val="27"/>
+          <w:szCs w:val="27"/>
+        </w:rPr>
+      </w:pPr>
+      <w:r>
+        <w:rPr>
+          <w:rFonts w:ascii="Arial" w:hAnsi="Arial" w:cs="Arial"/>
+          <w:caps/>
+          <w:color w:val="4D4D4D"/>
+          <w:spacing w:val="19"/>
+          <w:sz w:val="27"/>
+          <w:szCs w:val="27"/>
+        </w:rPr>
         <w:t>FIGURE 3. AN ILLUSTRATION OF FORKJOINPOOL’S WORK-STEALING ALGORITHM</w:t>
       </w:r>
     </w:p>
@@ -10797,6 +11393,55 @@
           <w:spacing w:val="24"/>
         </w:rPr>
       </w:pPr>
+      <w:r>
+        <w:rPr>
+          <w:rStyle w:val="HTMLCode"/>
+          <w:rFonts w:ascii="inherit" w:hAnsi="inherit"/>
+          <w:color w:val="0C0C0C"/>
+          <w:spacing w:val="24"/>
+        </w:rPr>
+        <w:t xml:space="preserve">  public static void </w:t>
+      </w:r>
+      <w:proofErr w:type="gramStart"/>
+      <w:r>
+        <w:rPr>
+          <w:rStyle w:val="HTMLCode"/>
+          <w:rFonts w:ascii="inherit" w:hAnsi="inherit"/>
+          <w:color w:val="0C0C0C"/>
+          <w:spacing w:val="24"/>
+        </w:rPr>
+        <w:t>main(</w:t>
+      </w:r>
+      <w:proofErr w:type="gramEnd"/>
+      <w:r>
+        <w:rPr>
+          <w:rStyle w:val="HTMLCode"/>
+          <w:rFonts w:ascii="inherit" w:hAnsi="inherit"/>
+          <w:color w:val="0C0C0C"/>
+          <w:spacing w:val="24"/>
+        </w:rPr>
+        <w:t xml:space="preserve">String[] </w:t>
+      </w:r>
+      <w:proofErr w:type="spellStart"/>
+      <w:r>
+        <w:rPr>
+          <w:rStyle w:val="HTMLCode"/>
+          <w:rFonts w:ascii="inherit" w:hAnsi="inherit"/>
+          <w:color w:val="0C0C0C"/>
+          <w:spacing w:val="24"/>
+        </w:rPr>
+        <w:t>args</w:t>
+      </w:r>
+      <w:proofErr w:type="spellEnd"/>
+      <w:r>
+        <w:rPr>
+          <w:rStyle w:val="HTMLCode"/>
+          <w:rFonts w:ascii="inherit" w:hAnsi="inherit"/>
+          <w:color w:val="0C0C0C"/>
+          <w:spacing w:val="24"/>
+        </w:rPr>
+        <w:t>) {</w:t>
+      </w:r>
     </w:p>
     <w:p>
       <w:pPr>
@@ -10817,8 +11462,49 @@
           <w:color w:val="0C0C0C"/>
           <w:spacing w:val="24"/>
         </w:rPr>
-        <w:t xml:space="preserve">  public static void </w:t>
-      </w:r>
+        <w:t xml:space="preserve">    </w:t>
+      </w:r>
+      <w:proofErr w:type="spellStart"/>
+      <w:r>
+        <w:rPr>
+          <w:rStyle w:val="HTMLCode"/>
+          <w:rFonts w:ascii="inherit" w:hAnsi="inherit"/>
+          <w:color w:val="0C0C0C"/>
+          <w:spacing w:val="24"/>
+        </w:rPr>
+        <w:t>ForkJoinPool</w:t>
+      </w:r>
+      <w:proofErr w:type="spellEnd"/>
+      <w:r>
+        <w:rPr>
+          <w:rStyle w:val="HTMLCode"/>
+          <w:rFonts w:ascii="inherit" w:hAnsi="inherit"/>
+          <w:color w:val="0C0C0C"/>
+          <w:spacing w:val="24"/>
+        </w:rPr>
+        <w:t xml:space="preserve"> </w:t>
+      </w:r>
+      <w:proofErr w:type="spellStart"/>
+      <w:r>
+        <w:rPr>
+          <w:rStyle w:val="HTMLCode"/>
+          <w:rFonts w:ascii="inherit" w:hAnsi="inherit"/>
+          <w:color w:val="0C0C0C"/>
+          <w:spacing w:val="24"/>
+        </w:rPr>
+        <w:t>forkJoinPool</w:t>
+      </w:r>
+      <w:proofErr w:type="spellEnd"/>
+      <w:r>
+        <w:rPr>
+          <w:rStyle w:val="HTMLCode"/>
+          <w:rFonts w:ascii="inherit" w:hAnsi="inherit"/>
+          <w:color w:val="0C0C0C"/>
+          <w:spacing w:val="24"/>
+        </w:rPr>
+        <w:t xml:space="preserve"> = new </w:t>
+      </w:r>
+      <w:proofErr w:type="spellStart"/>
       <w:proofErr w:type="gramStart"/>
       <w:r>
         <w:rPr>
@@ -10827,7 +11513,17 @@
           <w:color w:val="0C0C0C"/>
           <w:spacing w:val="24"/>
         </w:rPr>
-        <w:t>main(</w:t>
+        <w:t>ForkJoinPool</w:t>
+      </w:r>
+      <w:proofErr w:type="spellEnd"/>
+      <w:r>
+        <w:rPr>
+          <w:rStyle w:val="HTMLCode"/>
+          <w:rFonts w:ascii="inherit" w:hAnsi="inherit"/>
+          <w:color w:val="0C0C0C"/>
+          <w:spacing w:val="24"/>
+        </w:rPr>
+        <w:t>(</w:t>
       </w:r>
       <w:proofErr w:type="gramEnd"/>
       <w:r>
@@ -10837,27 +11533,7 @@
           <w:color w:val="0C0C0C"/>
           <w:spacing w:val="24"/>
         </w:rPr>
-        <w:t xml:space="preserve">String[] </w:t>
-      </w:r>
-      <w:proofErr w:type="spellStart"/>
-      <w:r>
-        <w:rPr>
-          <w:rStyle w:val="HTMLCode"/>
-          <w:rFonts w:ascii="inherit" w:hAnsi="inherit"/>
-          <w:color w:val="0C0C0C"/>
-          <w:spacing w:val="24"/>
-        </w:rPr>
-        <w:t>args</w:t>
-      </w:r>
-      <w:proofErr w:type="spellEnd"/>
-      <w:r>
-        <w:rPr>
-          <w:rStyle w:val="HTMLCode"/>
-          <w:rFonts w:ascii="inherit" w:hAnsi="inherit"/>
-          <w:color w:val="0C0C0C"/>
-          <w:spacing w:val="24"/>
-        </w:rPr>
-        <w:t>) {</w:t>
+        <w:t>);</w:t>
       </w:r>
     </w:p>
     <w:p>
@@ -10881,47 +11557,6 @@
         </w:rPr>
         <w:t xml:space="preserve">    </w:t>
       </w:r>
-      <w:proofErr w:type="spellStart"/>
-      <w:r>
-        <w:rPr>
-          <w:rStyle w:val="HTMLCode"/>
-          <w:rFonts w:ascii="inherit" w:hAnsi="inherit"/>
-          <w:color w:val="0C0C0C"/>
-          <w:spacing w:val="24"/>
-        </w:rPr>
-        <w:t>ForkJoinPool</w:t>
-      </w:r>
-      <w:proofErr w:type="spellEnd"/>
-      <w:r>
-        <w:rPr>
-          <w:rStyle w:val="HTMLCode"/>
-          <w:rFonts w:ascii="inherit" w:hAnsi="inherit"/>
-          <w:color w:val="0C0C0C"/>
-          <w:spacing w:val="24"/>
-        </w:rPr>
-        <w:t xml:space="preserve"> </w:t>
-      </w:r>
-      <w:proofErr w:type="spellStart"/>
-      <w:r>
-        <w:rPr>
-          <w:rStyle w:val="HTMLCode"/>
-          <w:rFonts w:ascii="inherit" w:hAnsi="inherit"/>
-          <w:color w:val="0C0C0C"/>
-          <w:spacing w:val="24"/>
-        </w:rPr>
-        <w:t>forkJoinPool</w:t>
-      </w:r>
-      <w:proofErr w:type="spellEnd"/>
-      <w:r>
-        <w:rPr>
-          <w:rStyle w:val="HTMLCode"/>
-          <w:rFonts w:ascii="inherit" w:hAnsi="inherit"/>
-          <w:color w:val="0C0C0C"/>
-          <w:spacing w:val="24"/>
-        </w:rPr>
-        <w:t xml:space="preserve"> = new </w:t>
-      </w:r>
-      <w:proofErr w:type="spellStart"/>
       <w:proofErr w:type="gramStart"/>
       <w:r>
         <w:rPr>
@@ -10930,17 +11565,7 @@
           <w:color w:val="0C0C0C"/>
           <w:spacing w:val="24"/>
         </w:rPr>
-        <w:t>ForkJoinPool</w:t>
-      </w:r>
-      <w:proofErr w:type="spellEnd"/>
-      <w:r>
-        <w:rPr>
-          <w:rStyle w:val="HTMLCode"/>
-          <w:rFonts w:ascii="inherit" w:hAnsi="inherit"/>
-          <w:color w:val="0C0C0C"/>
-          <w:spacing w:val="24"/>
-        </w:rPr>
-        <w:t>(</w:t>
+        <w:t>int[</w:t>
       </w:r>
       <w:proofErr w:type="gramEnd"/>
       <w:r>
@@ -10950,7 +11575,7 @@
           <w:color w:val="0C0C0C"/>
           <w:spacing w:val="24"/>
         </w:rPr>
-        <w:t>);</w:t>
+        <w:t>] array = {1, 5, 10, 15, 20, 25, 50};</w:t>
       </w:r>
     </w:p>
     <w:p>
@@ -10974,6 +11599,47 @@
         </w:rPr>
         <w:t xml:space="preserve">    </w:t>
       </w:r>
+      <w:proofErr w:type="spellStart"/>
+      <w:r>
+        <w:rPr>
+          <w:rStyle w:val="HTMLCode"/>
+          <w:rFonts w:ascii="inherit" w:hAnsi="inherit"/>
+          <w:color w:val="0C0C0C"/>
+          <w:spacing w:val="24"/>
+        </w:rPr>
+        <w:t>DoubleNumber</w:t>
+      </w:r>
+      <w:proofErr w:type="spellEnd"/>
+      <w:r>
+        <w:rPr>
+          <w:rStyle w:val="HTMLCode"/>
+          <w:rFonts w:ascii="inherit" w:hAnsi="inherit"/>
+          <w:color w:val="0C0C0C"/>
+          <w:spacing w:val="24"/>
+        </w:rPr>
+        <w:t xml:space="preserve"> </w:t>
+      </w:r>
+      <w:proofErr w:type="spellStart"/>
+      <w:r>
+        <w:rPr>
+          <w:rStyle w:val="HTMLCode"/>
+          <w:rFonts w:ascii="inherit" w:hAnsi="inherit"/>
+          <w:color w:val="0C0C0C"/>
+          <w:spacing w:val="24"/>
+        </w:rPr>
+        <w:t>doubleNumberTask</w:t>
+      </w:r>
+      <w:proofErr w:type="spellEnd"/>
+      <w:r>
+        <w:rPr>
+          <w:rStyle w:val="HTMLCode"/>
+          <w:rFonts w:ascii="inherit" w:hAnsi="inherit"/>
+          <w:color w:val="0C0C0C"/>
+          <w:spacing w:val="24"/>
+        </w:rPr>
+        <w:t xml:space="preserve"> = new </w:t>
+      </w:r>
+      <w:proofErr w:type="spellStart"/>
       <w:proofErr w:type="gramStart"/>
       <w:r>
         <w:rPr>
@@ -10982,7 +11648,17 @@
           <w:color w:val="0C0C0C"/>
           <w:spacing w:val="24"/>
         </w:rPr>
-        <w:t>int[</w:t>
+        <w:t>DoubleNumber</w:t>
+      </w:r>
+      <w:proofErr w:type="spellEnd"/>
+      <w:r>
+        <w:rPr>
+          <w:rStyle w:val="HTMLCode"/>
+          <w:rFonts w:ascii="inherit" w:hAnsi="inherit"/>
+          <w:color w:val="0C0C0C"/>
+          <w:spacing w:val="24"/>
+        </w:rPr>
+        <w:t>(</w:t>
       </w:r>
       <w:proofErr w:type="gramEnd"/>
       <w:r>
@@ -10992,7 +11668,27 @@
           <w:color w:val="0C0C0C"/>
           <w:spacing w:val="24"/>
         </w:rPr>
-        <w:t>] array = {1, 5, 10, 15, 20, 25, 50};</w:t>
+        <w:t xml:space="preserve">array, 0, </w:t>
+      </w:r>
+      <w:proofErr w:type="spellStart"/>
+      <w:r>
+        <w:rPr>
+          <w:rStyle w:val="HTMLCode"/>
+          <w:rFonts w:ascii="inherit" w:hAnsi="inherit"/>
+          <w:color w:val="0C0C0C"/>
+          <w:spacing w:val="24"/>
+        </w:rPr>
+        <w:t>array.length</w:t>
+      </w:r>
+      <w:proofErr w:type="spellEnd"/>
+      <w:r>
+        <w:rPr>
+          <w:rStyle w:val="HTMLCode"/>
+          <w:rFonts w:ascii="inherit" w:hAnsi="inherit"/>
+          <w:color w:val="0C0C0C"/>
+          <w:spacing w:val="24"/>
+        </w:rPr>
+        <w:t>);</w:t>
       </w:r>
     </w:p>
     <w:p>
@@ -11007,106 +11703,6 @@
           <w:spacing w:val="24"/>
         </w:rPr>
       </w:pPr>
-      <w:r>
-        <w:rPr>
-          <w:rStyle w:val="HTMLCode"/>
-          <w:rFonts w:ascii="inherit" w:hAnsi="inherit"/>
-          <w:color w:val="0C0C0C"/>
-          <w:spacing w:val="24"/>
-        </w:rPr>
-        <w:t xml:space="preserve">    </w:t>
-      </w:r>
-      <w:proofErr w:type="spellStart"/>
-      <w:r>
-        <w:rPr>
-          <w:rStyle w:val="HTMLCode"/>
-          <w:rFonts w:ascii="inherit" w:hAnsi="inherit"/>
-          <w:color w:val="0C0C0C"/>
-          <w:spacing w:val="24"/>
-        </w:rPr>
-        <w:t>DoubleNumber</w:t>
-      </w:r>
-      <w:proofErr w:type="spellEnd"/>
-      <w:r>
-        <w:rPr>
-          <w:rStyle w:val="HTMLCode"/>
-          <w:rFonts w:ascii="inherit" w:hAnsi="inherit"/>
-          <w:color w:val="0C0C0C"/>
-          <w:spacing w:val="24"/>
-        </w:rPr>
-        <w:t xml:space="preserve"> </w:t>
-      </w:r>
-      <w:proofErr w:type="spellStart"/>
-      <w:r>
-        <w:rPr>
-          <w:rStyle w:val="HTMLCode"/>
-          <w:rFonts w:ascii="inherit" w:hAnsi="inherit"/>
-          <w:color w:val="0C0C0C"/>
-          <w:spacing w:val="24"/>
-        </w:rPr>
-        <w:t>doubleNumberTask</w:t>
-      </w:r>
-      <w:proofErr w:type="spellEnd"/>
-      <w:r>
-        <w:rPr>
-          <w:rStyle w:val="HTMLCode"/>
-          <w:rFonts w:ascii="inherit" w:hAnsi="inherit"/>
-          <w:color w:val="0C0C0C"/>
-          <w:spacing w:val="24"/>
-        </w:rPr>
-        <w:t xml:space="preserve"> = new </w:t>
-      </w:r>
-      <w:proofErr w:type="spellStart"/>
-      <w:proofErr w:type="gramStart"/>
-      <w:r>
-        <w:rPr>
-          <w:rStyle w:val="HTMLCode"/>
-          <w:rFonts w:ascii="inherit" w:hAnsi="inherit"/>
-          <w:color w:val="0C0C0C"/>
-          <w:spacing w:val="24"/>
-        </w:rPr>
-        <w:t>DoubleNumber</w:t>
-      </w:r>
-      <w:proofErr w:type="spellEnd"/>
-      <w:r>
-        <w:rPr>
-          <w:rStyle w:val="HTMLCode"/>
-          <w:rFonts w:ascii="inherit" w:hAnsi="inherit"/>
-          <w:color w:val="0C0C0C"/>
-          <w:spacing w:val="24"/>
-        </w:rPr>
-        <w:t>(</w:t>
-      </w:r>
-      <w:proofErr w:type="gramEnd"/>
-      <w:r>
-        <w:rPr>
-          <w:rStyle w:val="HTMLCode"/>
-          <w:rFonts w:ascii="inherit" w:hAnsi="inherit"/>
-          <w:color w:val="0C0C0C"/>
-          <w:spacing w:val="24"/>
-        </w:rPr>
-        <w:t xml:space="preserve">array, 0, </w:t>
-      </w:r>
-      <w:proofErr w:type="spellStart"/>
-      <w:r>
-        <w:rPr>
-          <w:rStyle w:val="HTMLCode"/>
-          <w:rFonts w:ascii="inherit" w:hAnsi="inherit"/>
-          <w:color w:val="0C0C0C"/>
-          <w:spacing w:val="24"/>
-        </w:rPr>
-        <w:t>array.length</w:t>
-      </w:r>
-      <w:proofErr w:type="spellEnd"/>
-      <w:r>
-        <w:rPr>
-          <w:rStyle w:val="HTMLCode"/>
-          <w:rFonts w:ascii="inherit" w:hAnsi="inherit"/>
-          <w:color w:val="0C0C0C"/>
-          <w:spacing w:val="24"/>
-        </w:rPr>
-        <w:t>);</w:t>
-      </w:r>
     </w:p>
     <w:p>
       <w:pPr>
@@ -11120,6 +11716,15 @@
           <w:spacing w:val="24"/>
         </w:rPr>
       </w:pPr>
+      <w:r>
+        <w:rPr>
+          <w:rStyle w:val="HTMLCode"/>
+          <w:rFonts w:ascii="inherit" w:hAnsi="inherit"/>
+          <w:color w:val="0C0C0C"/>
+          <w:spacing w:val="24"/>
+        </w:rPr>
+        <w:t xml:space="preserve">    // Invokes compute method</w:t>
+      </w:r>
     </w:p>
     <w:p>
       <w:pPr>
@@ -11140,7 +11745,47 @@
           <w:color w:val="0C0C0C"/>
           <w:spacing w:val="24"/>
         </w:rPr>
-        <w:t xml:space="preserve">    // Invokes compute method</w:t>
+        <w:t xml:space="preserve">    </w:t>
+      </w:r>
+      <w:proofErr w:type="spellStart"/>
+      <w:r>
+        <w:rPr>
+          <w:rStyle w:val="HTMLCode"/>
+          <w:rFonts w:ascii="inherit" w:hAnsi="inherit"/>
+          <w:color w:val="0C0C0C"/>
+          <w:spacing w:val="24"/>
+        </w:rPr>
+        <w:t>forkJoinPool.invoke</w:t>
+      </w:r>
+      <w:proofErr w:type="spellEnd"/>
+      <w:r>
+        <w:rPr>
+          <w:rStyle w:val="HTMLCode"/>
+          <w:rFonts w:ascii="inherit" w:hAnsi="inherit"/>
+          <w:color w:val="0C0C0C"/>
+          <w:spacing w:val="24"/>
+        </w:rPr>
+        <w:t>(</w:t>
+      </w:r>
+      <w:proofErr w:type="spellStart"/>
+      <w:r>
+        <w:rPr>
+          <w:rStyle w:val="HTMLCode"/>
+          <w:rFonts w:ascii="inherit" w:hAnsi="inherit"/>
+          <w:color w:val="0C0C0C"/>
+          <w:spacing w:val="24"/>
+        </w:rPr>
+        <w:t>doubleNumberTask</w:t>
+      </w:r>
+      <w:proofErr w:type="spellEnd"/>
+      <w:r>
+        <w:rPr>
+          <w:rStyle w:val="HTMLCode"/>
+          <w:rFonts w:ascii="inherit" w:hAnsi="inherit"/>
+          <w:color w:val="0C0C0C"/>
+          <w:spacing w:val="24"/>
+        </w:rPr>
+        <w:t>);</w:t>
       </w:r>
     </w:p>
     <w:p>
@@ -11172,7 +11817,7 @@
           <w:color w:val="0C0C0C"/>
           <w:spacing w:val="24"/>
         </w:rPr>
-        <w:t>forkJoinPool.invoke</w:t>
+        <w:t>System.out.println</w:t>
       </w:r>
       <w:proofErr w:type="spellEnd"/>
       <w:r>
@@ -11192,7 +11837,7 @@
           <w:color w:val="0C0C0C"/>
           <w:spacing w:val="24"/>
         </w:rPr>
-        <w:t>doubleNumberTask</w:t>
+        <w:t>DoubleNumber.result</w:t>
       </w:r>
       <w:proofErr w:type="spellEnd"/>
       <w:r>
@@ -11224,47 +11869,7 @@
           <w:color w:val="0C0C0C"/>
           <w:spacing w:val="24"/>
         </w:rPr>
-        <w:t xml:space="preserve">    </w:t>
-      </w:r>
-      <w:proofErr w:type="spellStart"/>
-      <w:r>
-        <w:rPr>
-          <w:rStyle w:val="HTMLCode"/>
-          <w:rFonts w:ascii="inherit" w:hAnsi="inherit"/>
-          <w:color w:val="0C0C0C"/>
-          <w:spacing w:val="24"/>
-        </w:rPr>
-        <w:t>System.out.println</w:t>
-      </w:r>
-      <w:proofErr w:type="spellEnd"/>
-      <w:r>
-        <w:rPr>
-          <w:rStyle w:val="HTMLCode"/>
-          <w:rFonts w:ascii="inherit" w:hAnsi="inherit"/>
-          <w:color w:val="0C0C0C"/>
-          <w:spacing w:val="24"/>
-        </w:rPr>
-        <w:t>(</w:t>
-      </w:r>
-      <w:proofErr w:type="spellStart"/>
-      <w:r>
-        <w:rPr>
-          <w:rStyle w:val="HTMLCode"/>
-          <w:rFonts w:ascii="inherit" w:hAnsi="inherit"/>
-          <w:color w:val="0C0C0C"/>
-          <w:spacing w:val="24"/>
-        </w:rPr>
-        <w:t>DoubleNumber.result</w:t>
-      </w:r>
-      <w:proofErr w:type="spellEnd"/>
-      <w:r>
-        <w:rPr>
-          <w:rStyle w:val="HTMLCode"/>
-          <w:rFonts w:ascii="inherit" w:hAnsi="inherit"/>
-          <w:color w:val="0C0C0C"/>
-          <w:spacing w:val="24"/>
-        </w:rPr>
-        <w:t>);</w:t>
+        <w:t xml:space="preserve">  }</w:t>
       </w:r>
     </w:p>
     <w:p>
@@ -11286,7 +11891,7 @@
           <w:color w:val="0C0C0C"/>
           <w:spacing w:val="24"/>
         </w:rPr>
-        <w:t xml:space="preserve">  }</w:t>
+        <w:t>}</w:t>
       </w:r>
     </w:p>
     <w:p>
@@ -11301,15 +11906,6 @@
           <w:spacing w:val="24"/>
         </w:rPr>
       </w:pPr>
-      <w:r>
-        <w:rPr>
-          <w:rStyle w:val="HTMLCode"/>
-          <w:rFonts w:ascii="inherit" w:hAnsi="inherit"/>
-          <w:color w:val="0C0C0C"/>
-          <w:spacing w:val="24"/>
-        </w:rPr>
-        <w:t>}</w:t>
-      </w:r>
     </w:p>
     <w:p>
       <w:pPr>
@@ -11323,6 +11919,55 @@
           <w:spacing w:val="24"/>
         </w:rPr>
       </w:pPr>
+      <w:r>
+        <w:rPr>
+          <w:rStyle w:val="HTMLCode"/>
+          <w:rFonts w:ascii="inherit" w:hAnsi="inherit"/>
+          <w:color w:val="0C0C0C"/>
+          <w:spacing w:val="24"/>
+        </w:rPr>
+        <w:t xml:space="preserve">class </w:t>
+      </w:r>
+      <w:proofErr w:type="spellStart"/>
+      <w:r>
+        <w:rPr>
+          <w:rStyle w:val="HTMLCode"/>
+          <w:rFonts w:ascii="inherit" w:hAnsi="inherit"/>
+          <w:color w:val="0C0C0C"/>
+          <w:spacing w:val="24"/>
+        </w:rPr>
+        <w:t>DoubleNumber</w:t>
+      </w:r>
+      <w:proofErr w:type="spellEnd"/>
+      <w:r>
+        <w:rPr>
+          <w:rStyle w:val="HTMLCode"/>
+          <w:rFonts w:ascii="inherit" w:hAnsi="inherit"/>
+          <w:color w:val="0C0C0C"/>
+          <w:spacing w:val="24"/>
+        </w:rPr>
+        <w:t xml:space="preserve"> extends </w:t>
+      </w:r>
+      <w:proofErr w:type="spellStart"/>
+      <w:r>
+        <w:rPr>
+          <w:rStyle w:val="HTMLCode"/>
+          <w:rFonts w:ascii="inherit" w:hAnsi="inherit"/>
+          <w:color w:val="0C0C0C"/>
+          <w:spacing w:val="24"/>
+        </w:rPr>
+        <w:t>RecursiveAction</w:t>
+      </w:r>
+      <w:proofErr w:type="spellEnd"/>
+      <w:r>
+        <w:rPr>
+          <w:rStyle w:val="HTMLCode"/>
+          <w:rFonts w:ascii="inherit" w:hAnsi="inherit"/>
+          <w:color w:val="0C0C0C"/>
+          <w:spacing w:val="24"/>
+        </w:rPr>
+        <w:t xml:space="preserve"> {</w:t>
+      </w:r>
     </w:p>
     <w:p>
       <w:pPr>
@@ -11336,55 +11981,6 @@
           <w:spacing w:val="24"/>
         </w:rPr>
       </w:pPr>
-      <w:r>
-        <w:rPr>
-          <w:rStyle w:val="HTMLCode"/>
-          <w:rFonts w:ascii="inherit" w:hAnsi="inherit"/>
-          <w:color w:val="0C0C0C"/>
-          <w:spacing w:val="24"/>
-        </w:rPr>
-        <w:t xml:space="preserve">class </w:t>
-      </w:r>
-      <w:proofErr w:type="spellStart"/>
-      <w:r>
-        <w:rPr>
-          <w:rStyle w:val="HTMLCode"/>
-          <w:rFonts w:ascii="inherit" w:hAnsi="inherit"/>
-          <w:color w:val="0C0C0C"/>
-          <w:spacing w:val="24"/>
-        </w:rPr>
-        <w:t>DoubleNumber</w:t>
-      </w:r>
-      <w:proofErr w:type="spellEnd"/>
-      <w:r>
-        <w:rPr>
-          <w:rStyle w:val="HTMLCode"/>
-          <w:rFonts w:ascii="inherit" w:hAnsi="inherit"/>
-          <w:color w:val="0C0C0C"/>
-          <w:spacing w:val="24"/>
-        </w:rPr>
-        <w:t xml:space="preserve"> extends </w:t>
-      </w:r>
-      <w:proofErr w:type="spellStart"/>
-      <w:r>
-        <w:rPr>
-          <w:rStyle w:val="HTMLCode"/>
-          <w:rFonts w:ascii="inherit" w:hAnsi="inherit"/>
-          <w:color w:val="0C0C0C"/>
-          <w:spacing w:val="24"/>
-        </w:rPr>
-        <w:t>RecursiveAction</w:t>
-      </w:r>
-      <w:proofErr w:type="spellEnd"/>
-      <w:r>
-        <w:rPr>
-          <w:rStyle w:val="HTMLCode"/>
-          <w:rFonts w:ascii="inherit" w:hAnsi="inherit"/>
-          <w:color w:val="0C0C0C"/>
-          <w:spacing w:val="24"/>
-        </w:rPr>
-        <w:t xml:space="preserve"> {</w:t>
-      </w:r>
     </w:p>
     <w:p>
       <w:pPr>
@@ -11398,6 +11994,15 @@
           <w:spacing w:val="24"/>
         </w:rPr>
       </w:pPr>
+      <w:r>
+        <w:rPr>
+          <w:rStyle w:val="HTMLCode"/>
+          <w:rFonts w:ascii="inherit" w:hAnsi="inherit"/>
+          <w:color w:val="0C0C0C"/>
+          <w:spacing w:val="24"/>
+        </w:rPr>
+        <w:t xml:space="preserve">  final int PROCESS_THRESHOLD = 2;</w:t>
+      </w:r>
     </w:p>
     <w:p>
       <w:pPr>
@@ -11418,7 +12023,27 @@
           <w:color w:val="0C0C0C"/>
           <w:spacing w:val="24"/>
         </w:rPr>
-        <w:t xml:space="preserve">  final int PROCESS_THRESHOLD = 2;</w:t>
+        <w:t xml:space="preserve">  </w:t>
+      </w:r>
+      <w:proofErr w:type="gramStart"/>
+      <w:r>
+        <w:rPr>
+          <w:rStyle w:val="HTMLCode"/>
+          <w:rFonts w:ascii="inherit" w:hAnsi="inherit"/>
+          <w:color w:val="0C0C0C"/>
+          <w:spacing w:val="24"/>
+        </w:rPr>
+        <w:t>int[</w:t>
+      </w:r>
+      <w:proofErr w:type="gramEnd"/>
+      <w:r>
+        <w:rPr>
+          <w:rStyle w:val="HTMLCode"/>
+          <w:rFonts w:ascii="inherit" w:hAnsi="inherit"/>
+          <w:color w:val="0C0C0C"/>
+          <w:spacing w:val="24"/>
+        </w:rPr>
+        <w:t>] array;</w:t>
       </w:r>
     </w:p>
     <w:p>
@@ -11440,27 +12065,47 @@
           <w:color w:val="0C0C0C"/>
           <w:spacing w:val="24"/>
         </w:rPr>
-        <w:t xml:space="preserve">  </w:t>
-      </w:r>
-      <w:proofErr w:type="gramStart"/>
-      <w:r>
-        <w:rPr>
-          <w:rStyle w:val="HTMLCode"/>
-          <w:rFonts w:ascii="inherit" w:hAnsi="inherit"/>
-          <w:color w:val="0C0C0C"/>
-          <w:spacing w:val="24"/>
-        </w:rPr>
-        <w:t>int[</w:t>
-      </w:r>
-      <w:proofErr w:type="gramEnd"/>
-      <w:r>
-        <w:rPr>
-          <w:rStyle w:val="HTMLCode"/>
-          <w:rFonts w:ascii="inherit" w:hAnsi="inherit"/>
-          <w:color w:val="0C0C0C"/>
-          <w:spacing w:val="24"/>
-        </w:rPr>
-        <w:t>] array;</w:t>
+        <w:t xml:space="preserve">  int </w:t>
+      </w:r>
+      <w:proofErr w:type="spellStart"/>
+      <w:r>
+        <w:rPr>
+          <w:rStyle w:val="HTMLCode"/>
+          <w:rFonts w:ascii="inherit" w:hAnsi="inherit"/>
+          <w:color w:val="0C0C0C"/>
+          <w:spacing w:val="24"/>
+        </w:rPr>
+        <w:t>startIndex</w:t>
+      </w:r>
+      <w:proofErr w:type="spellEnd"/>
+      <w:r>
+        <w:rPr>
+          <w:rStyle w:val="HTMLCode"/>
+          <w:rFonts w:ascii="inherit" w:hAnsi="inherit"/>
+          <w:color w:val="0C0C0C"/>
+          <w:spacing w:val="24"/>
+        </w:rPr>
+        <w:t xml:space="preserve">, </w:t>
+      </w:r>
+      <w:proofErr w:type="spellStart"/>
+      <w:r>
+        <w:rPr>
+          <w:rStyle w:val="HTMLCode"/>
+          <w:rFonts w:ascii="inherit" w:hAnsi="inherit"/>
+          <w:color w:val="0C0C0C"/>
+          <w:spacing w:val="24"/>
+        </w:rPr>
+        <w:t>endIndex</w:t>
+      </w:r>
+      <w:proofErr w:type="spellEnd"/>
+      <w:r>
+        <w:rPr>
+          <w:rStyle w:val="HTMLCode"/>
+          <w:rFonts w:ascii="inherit" w:hAnsi="inherit"/>
+          <w:color w:val="0C0C0C"/>
+          <w:spacing w:val="24"/>
+        </w:rPr>
+        <w:t>;</w:t>
       </w:r>
     </w:p>
     <w:p>
@@ -11483,47 +12128,7 @@
           <w:spacing w:val="24"/>
         </w:rPr>
         <w:lastRenderedPageBreak/>
-        <w:t xml:space="preserve">  int </w:t>
-      </w:r>
-      <w:proofErr w:type="spellStart"/>
-      <w:r>
-        <w:rPr>
-          <w:rStyle w:val="HTMLCode"/>
-          <w:rFonts w:ascii="inherit" w:hAnsi="inherit"/>
-          <w:color w:val="0C0C0C"/>
-          <w:spacing w:val="24"/>
-        </w:rPr>
-        <w:t>startIndex</w:t>
-      </w:r>
-      <w:proofErr w:type="spellEnd"/>
-      <w:r>
-        <w:rPr>
-          <w:rStyle w:val="HTMLCode"/>
-          <w:rFonts w:ascii="inherit" w:hAnsi="inherit"/>
-          <w:color w:val="0C0C0C"/>
-          <w:spacing w:val="24"/>
-        </w:rPr>
-        <w:t xml:space="preserve">, </w:t>
-      </w:r>
-      <w:proofErr w:type="spellStart"/>
-      <w:r>
-        <w:rPr>
-          <w:rStyle w:val="HTMLCode"/>
-          <w:rFonts w:ascii="inherit" w:hAnsi="inherit"/>
-          <w:color w:val="0C0C0C"/>
-          <w:spacing w:val="24"/>
-        </w:rPr>
-        <w:t>endIndex</w:t>
-      </w:r>
-      <w:proofErr w:type="spellEnd"/>
-      <w:r>
-        <w:rPr>
-          <w:rStyle w:val="HTMLCode"/>
-          <w:rFonts w:ascii="inherit" w:hAnsi="inherit"/>
-          <w:color w:val="0C0C0C"/>
-          <w:spacing w:val="24"/>
-        </w:rPr>
-        <w:t>;</w:t>
+        <w:t xml:space="preserve">  static int result;</w:t>
       </w:r>
     </w:p>
     <w:p>
@@ -11538,15 +12143,6 @@
           <w:spacing w:val="24"/>
         </w:rPr>
       </w:pPr>
-      <w:r>
-        <w:rPr>
-          <w:rStyle w:val="HTMLCode"/>
-          <w:rFonts w:ascii="inherit" w:hAnsi="inherit"/>
-          <w:color w:val="0C0C0C"/>
-          <w:spacing w:val="24"/>
-        </w:rPr>
-        <w:t xml:space="preserve">  static int result;</w:t>
-      </w:r>
     </w:p>
     <w:p>
       <w:pPr>
@@ -11560,6 +12156,95 @@
           <w:spacing w:val="24"/>
         </w:rPr>
       </w:pPr>
+      <w:r>
+        <w:rPr>
+          <w:rStyle w:val="HTMLCode"/>
+          <w:rFonts w:ascii="inherit" w:hAnsi="inherit"/>
+          <w:color w:val="0C0C0C"/>
+          <w:spacing w:val="24"/>
+        </w:rPr>
+        <w:t xml:space="preserve">  </w:t>
+      </w:r>
+      <w:proofErr w:type="spellStart"/>
+      <w:r>
+        <w:rPr>
+          <w:rStyle w:val="HTMLCode"/>
+          <w:rFonts w:ascii="inherit" w:hAnsi="inherit"/>
+          <w:color w:val="0C0C0C"/>
+          <w:spacing w:val="24"/>
+        </w:rPr>
+        <w:t>DoubleNumber</w:t>
+      </w:r>
+      <w:proofErr w:type="spellEnd"/>
+      <w:r>
+        <w:rPr>
+          <w:rStyle w:val="HTMLCode"/>
+          <w:rFonts w:ascii="inherit" w:hAnsi="inherit"/>
+          <w:color w:val="0C0C0C"/>
+          <w:spacing w:val="24"/>
+        </w:rPr>
+        <w:t>(</w:t>
+      </w:r>
+      <w:proofErr w:type="gramStart"/>
+      <w:r>
+        <w:rPr>
+          <w:rStyle w:val="HTMLCode"/>
+          <w:rFonts w:ascii="inherit" w:hAnsi="inherit"/>
+          <w:color w:val="0C0C0C"/>
+          <w:spacing w:val="24"/>
+        </w:rPr>
+        <w:t>int[</w:t>
+      </w:r>
+      <w:proofErr w:type="gramEnd"/>
+      <w:r>
+        <w:rPr>
+          <w:rStyle w:val="HTMLCode"/>
+          <w:rFonts w:ascii="inherit" w:hAnsi="inherit"/>
+          <w:color w:val="0C0C0C"/>
+          <w:spacing w:val="24"/>
+        </w:rPr>
+        <w:t xml:space="preserve">] array, int </w:t>
+      </w:r>
+      <w:proofErr w:type="spellStart"/>
+      <w:r>
+        <w:rPr>
+          <w:rStyle w:val="HTMLCode"/>
+          <w:rFonts w:ascii="inherit" w:hAnsi="inherit"/>
+          <w:color w:val="0C0C0C"/>
+          <w:spacing w:val="24"/>
+        </w:rPr>
+        <w:t>startIndex</w:t>
+      </w:r>
+      <w:proofErr w:type="spellEnd"/>
+      <w:r>
+        <w:rPr>
+          <w:rStyle w:val="HTMLCode"/>
+          <w:rFonts w:ascii="inherit" w:hAnsi="inherit"/>
+          <w:color w:val="0C0C0C"/>
+          <w:spacing w:val="24"/>
+        </w:rPr>
+        <w:t xml:space="preserve">, int </w:t>
+      </w:r>
+      <w:proofErr w:type="spellStart"/>
+      <w:r>
+        <w:rPr>
+          <w:rStyle w:val="HTMLCode"/>
+          <w:rFonts w:ascii="inherit" w:hAnsi="inherit"/>
+          <w:color w:val="0C0C0C"/>
+          <w:spacing w:val="24"/>
+        </w:rPr>
+        <w:t>endIndex</w:t>
+      </w:r>
+      <w:proofErr w:type="spellEnd"/>
+      <w:r>
+        <w:rPr>
+          <w:rStyle w:val="HTMLCode"/>
+          <w:rFonts w:ascii="inherit" w:hAnsi="inherit"/>
+          <w:color w:val="0C0C0C"/>
+          <w:spacing w:val="24"/>
+        </w:rPr>
+        <w:t>) {</w:t>
+      </w:r>
     </w:p>
     <w:p>
       <w:pPr>
@@ -11580,28 +12265,9 @@
           <w:color w:val="0C0C0C"/>
           <w:spacing w:val="24"/>
         </w:rPr>
-        <w:t xml:space="preserve">  </w:t>
-      </w:r>
-      <w:proofErr w:type="spellStart"/>
-      <w:r>
-        <w:rPr>
-          <w:rStyle w:val="HTMLCode"/>
-          <w:rFonts w:ascii="inherit" w:hAnsi="inherit"/>
-          <w:color w:val="0C0C0C"/>
-          <w:spacing w:val="24"/>
-        </w:rPr>
-        <w:t>DoubleNumber</w:t>
-      </w:r>
-      <w:proofErr w:type="spellEnd"/>
-      <w:r>
-        <w:rPr>
-          <w:rStyle w:val="HTMLCode"/>
-          <w:rFonts w:ascii="inherit" w:hAnsi="inherit"/>
-          <w:color w:val="0C0C0C"/>
-          <w:spacing w:val="24"/>
-        </w:rPr>
-        <w:t>(</w:t>
-      </w:r>
+        <w:t xml:space="preserve">    </w:t>
+      </w:r>
+      <w:proofErr w:type="spellStart"/>
       <w:proofErr w:type="gramStart"/>
       <w:r>
         <w:rPr>
@@ -11610,8 +12276,9 @@
           <w:color w:val="0C0C0C"/>
           <w:spacing w:val="24"/>
         </w:rPr>
-        <w:t>int[</w:t>
-      </w:r>
+        <w:t>this.array</w:t>
+      </w:r>
+      <w:proofErr w:type="spellEnd"/>
       <w:proofErr w:type="gramEnd"/>
       <w:r>
         <w:rPr>
@@ -11620,47 +12287,7 @@
           <w:color w:val="0C0C0C"/>
           <w:spacing w:val="24"/>
         </w:rPr>
-        <w:t xml:space="preserve">] array, int </w:t>
-      </w:r>
-      <w:proofErr w:type="spellStart"/>
-      <w:r>
-        <w:rPr>
-          <w:rStyle w:val="HTMLCode"/>
-          <w:rFonts w:ascii="inherit" w:hAnsi="inherit"/>
-          <w:color w:val="0C0C0C"/>
-          <w:spacing w:val="24"/>
-        </w:rPr>
-        <w:t>startIndex</w:t>
-      </w:r>
-      <w:proofErr w:type="spellEnd"/>
-      <w:r>
-        <w:rPr>
-          <w:rStyle w:val="HTMLCode"/>
-          <w:rFonts w:ascii="inherit" w:hAnsi="inherit"/>
-          <w:color w:val="0C0C0C"/>
-          <w:spacing w:val="24"/>
-        </w:rPr>
-        <w:t xml:space="preserve">, int </w:t>
-      </w:r>
-      <w:proofErr w:type="spellStart"/>
-      <w:r>
-        <w:rPr>
-          <w:rStyle w:val="HTMLCode"/>
-          <w:rFonts w:ascii="inherit" w:hAnsi="inherit"/>
-          <w:color w:val="0C0C0C"/>
-          <w:spacing w:val="24"/>
-        </w:rPr>
-        <w:t>endIndex</w:t>
-      </w:r>
-      <w:proofErr w:type="spellEnd"/>
-      <w:r>
-        <w:rPr>
-          <w:rStyle w:val="HTMLCode"/>
-          <w:rFonts w:ascii="inherit" w:hAnsi="inherit"/>
-          <w:color w:val="0C0C0C"/>
-          <w:spacing w:val="24"/>
-        </w:rPr>
-        <w:t>) {</w:t>
+        <w:t xml:space="preserve"> = array;</w:t>
       </w:r>
     </w:p>
     <w:p>
@@ -11693,7 +12320,7 @@
           <w:color w:val="0C0C0C"/>
           <w:spacing w:val="24"/>
         </w:rPr>
-        <w:t>this.array</w:t>
+        <w:t>this.startIndex</w:t>
       </w:r>
       <w:proofErr w:type="spellEnd"/>
       <w:proofErr w:type="gramEnd"/>
@@ -11704,7 +12331,27 @@
           <w:color w:val="0C0C0C"/>
           <w:spacing w:val="24"/>
         </w:rPr>
-        <w:t xml:space="preserve"> = array;</w:t>
+        <w:t xml:space="preserve"> = </w:t>
+      </w:r>
+      <w:proofErr w:type="spellStart"/>
+      <w:r>
+        <w:rPr>
+          <w:rStyle w:val="HTMLCode"/>
+          <w:rFonts w:ascii="inherit" w:hAnsi="inherit"/>
+          <w:color w:val="0C0C0C"/>
+          <w:spacing w:val="24"/>
+        </w:rPr>
+        <w:t>startIndex</w:t>
+      </w:r>
+      <w:proofErr w:type="spellEnd"/>
+      <w:r>
+        <w:rPr>
+          <w:rStyle w:val="HTMLCode"/>
+          <w:rFonts w:ascii="inherit" w:hAnsi="inherit"/>
+          <w:color w:val="0C0C0C"/>
+          <w:spacing w:val="24"/>
+        </w:rPr>
+        <w:t>;</w:t>
       </w:r>
     </w:p>
     <w:p>
@@ -11737,7 +12384,7 @@
           <w:color w:val="0C0C0C"/>
           <w:spacing w:val="24"/>
         </w:rPr>
-        <w:t>this.startIndex</w:t>
+        <w:t>this.endIndex</w:t>
       </w:r>
       <w:proofErr w:type="spellEnd"/>
       <w:proofErr w:type="gramEnd"/>
@@ -11758,7 +12405,7 @@
           <w:color w:val="0C0C0C"/>
           <w:spacing w:val="24"/>
         </w:rPr>
-        <w:t>startIndex</w:t>
+        <w:t>endIndex</w:t>
       </w:r>
       <w:proofErr w:type="spellEnd"/>
       <w:r>
@@ -11790,49 +12437,7 @@
           <w:color w:val="0C0C0C"/>
           <w:spacing w:val="24"/>
         </w:rPr>
-        <w:t xml:space="preserve">    </w:t>
-      </w:r>
-      <w:proofErr w:type="spellStart"/>
-      <w:proofErr w:type="gramStart"/>
-      <w:r>
-        <w:rPr>
-          <w:rStyle w:val="HTMLCode"/>
-          <w:rFonts w:ascii="inherit" w:hAnsi="inherit"/>
-          <w:color w:val="0C0C0C"/>
-          <w:spacing w:val="24"/>
-        </w:rPr>
-        <w:t>this.endIndex</w:t>
-      </w:r>
-      <w:proofErr w:type="spellEnd"/>
-      <w:proofErr w:type="gramEnd"/>
-      <w:r>
-        <w:rPr>
-          <w:rStyle w:val="HTMLCode"/>
-          <w:rFonts w:ascii="inherit" w:hAnsi="inherit"/>
-          <w:color w:val="0C0C0C"/>
-          <w:spacing w:val="24"/>
-        </w:rPr>
-        <w:t xml:space="preserve"> = </w:t>
-      </w:r>
-      <w:proofErr w:type="spellStart"/>
-      <w:r>
-        <w:rPr>
-          <w:rStyle w:val="HTMLCode"/>
-          <w:rFonts w:ascii="inherit" w:hAnsi="inherit"/>
-          <w:color w:val="0C0C0C"/>
-          <w:spacing w:val="24"/>
-        </w:rPr>
-        <w:t>endIndex</w:t>
-      </w:r>
-      <w:proofErr w:type="spellEnd"/>
-      <w:r>
-        <w:rPr>
-          <w:rStyle w:val="HTMLCode"/>
-          <w:rFonts w:ascii="inherit" w:hAnsi="inherit"/>
-          <w:color w:val="0C0C0C"/>
-          <w:spacing w:val="24"/>
-        </w:rPr>
-        <w:t>;</w:t>
+        <w:t xml:space="preserve">  }</w:t>
       </w:r>
     </w:p>
     <w:p>
@@ -11847,15 +12452,6 @@
           <w:spacing w:val="24"/>
         </w:rPr>
       </w:pPr>
-      <w:r>
-        <w:rPr>
-          <w:rStyle w:val="HTMLCode"/>
-          <w:rFonts w:ascii="inherit" w:hAnsi="inherit"/>
-          <w:color w:val="0C0C0C"/>
-          <w:spacing w:val="24"/>
-        </w:rPr>
-        <w:t xml:space="preserve">  }</w:t>
-      </w:r>
     </w:p>
     <w:p>
       <w:pPr>
@@ -11869,6 +12465,15 @@
           <w:spacing w:val="24"/>
         </w:rPr>
       </w:pPr>
+      <w:r>
+        <w:rPr>
+          <w:rStyle w:val="HTMLCode"/>
+          <w:rFonts w:ascii="inherit" w:hAnsi="inherit"/>
+          <w:color w:val="0C0C0C"/>
+          <w:spacing w:val="24"/>
+        </w:rPr>
+        <w:t xml:space="preserve">  @Override</w:t>
+      </w:r>
     </w:p>
     <w:p>
       <w:pPr>
@@ -11889,7 +12494,27 @@
           <w:color w:val="0C0C0C"/>
           <w:spacing w:val="24"/>
         </w:rPr>
-        <w:t xml:space="preserve">  @Override</w:t>
+        <w:t xml:space="preserve">  protected void </w:t>
+      </w:r>
+      <w:proofErr w:type="gramStart"/>
+      <w:r>
+        <w:rPr>
+          <w:rStyle w:val="HTMLCode"/>
+          <w:rFonts w:ascii="inherit" w:hAnsi="inherit"/>
+          <w:color w:val="0C0C0C"/>
+          <w:spacing w:val="24"/>
+        </w:rPr>
+        <w:t>compute(</w:t>
+      </w:r>
+      <w:proofErr w:type="gramEnd"/>
+      <w:r>
+        <w:rPr>
+          <w:rStyle w:val="HTMLCode"/>
+          <w:rFonts w:ascii="inherit" w:hAnsi="inherit"/>
+          <w:color w:val="0C0C0C"/>
+          <w:spacing w:val="24"/>
+        </w:rPr>
+        <w:t>) {</w:t>
       </w:r>
     </w:p>
     <w:p>
@@ -11911,27 +12536,47 @@
           <w:color w:val="0C0C0C"/>
           <w:spacing w:val="24"/>
         </w:rPr>
-        <w:t xml:space="preserve">  protected void </w:t>
-      </w:r>
-      <w:proofErr w:type="gramStart"/>
-      <w:r>
-        <w:rPr>
-          <w:rStyle w:val="HTMLCode"/>
-          <w:rFonts w:ascii="inherit" w:hAnsi="inherit"/>
-          <w:color w:val="0C0C0C"/>
-          <w:spacing w:val="24"/>
-        </w:rPr>
-        <w:t>compute(</w:t>
-      </w:r>
-      <w:proofErr w:type="gramEnd"/>
-      <w:r>
-        <w:rPr>
-          <w:rStyle w:val="HTMLCode"/>
-          <w:rFonts w:ascii="inherit" w:hAnsi="inherit"/>
-          <w:color w:val="0C0C0C"/>
-          <w:spacing w:val="24"/>
-        </w:rPr>
-        <w:t>) {</w:t>
+        <w:t xml:space="preserve">    if (</w:t>
+      </w:r>
+      <w:proofErr w:type="spellStart"/>
+      <w:r>
+        <w:rPr>
+          <w:rStyle w:val="HTMLCode"/>
+          <w:rFonts w:ascii="inherit" w:hAnsi="inherit"/>
+          <w:color w:val="0C0C0C"/>
+          <w:spacing w:val="24"/>
+        </w:rPr>
+        <w:t>endIndex</w:t>
+      </w:r>
+      <w:proofErr w:type="spellEnd"/>
+      <w:r>
+        <w:rPr>
+          <w:rStyle w:val="HTMLCode"/>
+          <w:rFonts w:ascii="inherit" w:hAnsi="inherit"/>
+          <w:color w:val="0C0C0C"/>
+          <w:spacing w:val="24"/>
+        </w:rPr>
+        <w:t xml:space="preserve"> - </w:t>
+      </w:r>
+      <w:proofErr w:type="spellStart"/>
+      <w:r>
+        <w:rPr>
+          <w:rStyle w:val="HTMLCode"/>
+          <w:rFonts w:ascii="inherit" w:hAnsi="inherit"/>
+          <w:color w:val="0C0C0C"/>
+          <w:spacing w:val="24"/>
+        </w:rPr>
+        <w:t>startIndex</w:t>
+      </w:r>
+      <w:proofErr w:type="spellEnd"/>
+      <w:r>
+        <w:rPr>
+          <w:rStyle w:val="HTMLCode"/>
+          <w:rFonts w:ascii="inherit" w:hAnsi="inherit"/>
+          <w:color w:val="0C0C0C"/>
+          <w:spacing w:val="24"/>
+        </w:rPr>
+        <w:t xml:space="preserve"> &lt;= PROCESS_THRESHOLD) {</w:t>
       </w:r>
     </w:p>
     <w:p>
@@ -11953,7 +12598,67 @@
           <w:color w:val="0C0C0C"/>
           <w:spacing w:val="24"/>
         </w:rPr>
-        <w:t xml:space="preserve">    if (</w:t>
+        <w:t xml:space="preserve">      for (int </w:t>
+      </w:r>
+      <w:proofErr w:type="spellStart"/>
+      <w:r>
+        <w:rPr>
+          <w:rStyle w:val="HTMLCode"/>
+          <w:rFonts w:ascii="inherit" w:hAnsi="inherit"/>
+          <w:color w:val="0C0C0C"/>
+          <w:spacing w:val="24"/>
+        </w:rPr>
+        <w:t>i</w:t>
+      </w:r>
+      <w:proofErr w:type="spellEnd"/>
+      <w:r>
+        <w:rPr>
+          <w:rStyle w:val="HTMLCode"/>
+          <w:rFonts w:ascii="inherit" w:hAnsi="inherit"/>
+          <w:color w:val="0C0C0C"/>
+          <w:spacing w:val="24"/>
+        </w:rPr>
+        <w:t xml:space="preserve"> = </w:t>
+      </w:r>
+      <w:proofErr w:type="spellStart"/>
+      <w:r>
+        <w:rPr>
+          <w:rStyle w:val="HTMLCode"/>
+          <w:rFonts w:ascii="inherit" w:hAnsi="inherit"/>
+          <w:color w:val="0C0C0C"/>
+          <w:spacing w:val="24"/>
+        </w:rPr>
+        <w:t>startIndex</w:t>
+      </w:r>
+      <w:proofErr w:type="spellEnd"/>
+      <w:r>
+        <w:rPr>
+          <w:rStyle w:val="HTMLCode"/>
+          <w:rFonts w:ascii="inherit" w:hAnsi="inherit"/>
+          <w:color w:val="0C0C0C"/>
+          <w:spacing w:val="24"/>
+        </w:rPr>
+        <w:t xml:space="preserve">; </w:t>
+      </w:r>
+      <w:proofErr w:type="spellStart"/>
+      <w:r>
+        <w:rPr>
+          <w:rStyle w:val="HTMLCode"/>
+          <w:rFonts w:ascii="inherit" w:hAnsi="inherit"/>
+          <w:color w:val="0C0C0C"/>
+          <w:spacing w:val="24"/>
+        </w:rPr>
+        <w:t>i</w:t>
+      </w:r>
+      <w:proofErr w:type="spellEnd"/>
+      <w:r>
+        <w:rPr>
+          <w:rStyle w:val="HTMLCode"/>
+          <w:rFonts w:ascii="inherit" w:hAnsi="inherit"/>
+          <w:color w:val="0C0C0C"/>
+          <w:spacing w:val="24"/>
+        </w:rPr>
+        <w:t xml:space="preserve"> &lt; </w:t>
       </w:r>
       <w:proofErr w:type="spellStart"/>
       <w:r>
@@ -11973,27 +12678,27 @@
           <w:color w:val="0C0C0C"/>
           <w:spacing w:val="24"/>
         </w:rPr>
-        <w:t xml:space="preserve"> - </w:t>
-      </w:r>
-      <w:proofErr w:type="spellStart"/>
-      <w:r>
-        <w:rPr>
-          <w:rStyle w:val="HTMLCode"/>
-          <w:rFonts w:ascii="inherit" w:hAnsi="inherit"/>
-          <w:color w:val="0C0C0C"/>
-          <w:spacing w:val="24"/>
-        </w:rPr>
-        <w:t>startIndex</w:t>
-      </w:r>
-      <w:proofErr w:type="spellEnd"/>
-      <w:r>
-        <w:rPr>
-          <w:rStyle w:val="HTMLCode"/>
-          <w:rFonts w:ascii="inherit" w:hAnsi="inherit"/>
-          <w:color w:val="0C0C0C"/>
-          <w:spacing w:val="24"/>
-        </w:rPr>
-        <w:t xml:space="preserve"> &lt;= PROCESS_THRESHOLD) {</w:t>
+        <w:t xml:space="preserve">; </w:t>
+      </w:r>
+      <w:proofErr w:type="spellStart"/>
+      <w:r>
+        <w:rPr>
+          <w:rStyle w:val="HTMLCode"/>
+          <w:rFonts w:ascii="inherit" w:hAnsi="inherit"/>
+          <w:color w:val="0C0C0C"/>
+          <w:spacing w:val="24"/>
+        </w:rPr>
+        <w:t>i</w:t>
+      </w:r>
+      <w:proofErr w:type="spellEnd"/>
+      <w:r>
+        <w:rPr>
+          <w:rStyle w:val="HTMLCode"/>
+          <w:rFonts w:ascii="inherit" w:hAnsi="inherit"/>
+          <w:color w:val="0C0C0C"/>
+          <w:spacing w:val="24"/>
+        </w:rPr>
+        <w:t>++) {</w:t>
       </w:r>
     </w:p>
     <w:p>
@@ -12015,7 +12720,7 @@
           <w:color w:val="0C0C0C"/>
           <w:spacing w:val="24"/>
         </w:rPr>
-        <w:t xml:space="preserve">      for (int </w:t>
+        <w:t xml:space="preserve">        result += array[</w:t>
       </w:r>
       <w:proofErr w:type="spellStart"/>
       <w:r>
@@ -12035,87 +12740,7 @@
           <w:color w:val="0C0C0C"/>
           <w:spacing w:val="24"/>
         </w:rPr>
-        <w:t xml:space="preserve"> = </w:t>
-      </w:r>
-      <w:proofErr w:type="spellStart"/>
-      <w:r>
-        <w:rPr>
-          <w:rStyle w:val="HTMLCode"/>
-          <w:rFonts w:ascii="inherit" w:hAnsi="inherit"/>
-          <w:color w:val="0C0C0C"/>
-          <w:spacing w:val="24"/>
-        </w:rPr>
-        <w:t>startIndex</w:t>
-      </w:r>
-      <w:proofErr w:type="spellEnd"/>
-      <w:r>
-        <w:rPr>
-          <w:rStyle w:val="HTMLCode"/>
-          <w:rFonts w:ascii="inherit" w:hAnsi="inherit"/>
-          <w:color w:val="0C0C0C"/>
-          <w:spacing w:val="24"/>
-        </w:rPr>
-        <w:t xml:space="preserve">; </w:t>
-      </w:r>
-      <w:proofErr w:type="spellStart"/>
-      <w:r>
-        <w:rPr>
-          <w:rStyle w:val="HTMLCode"/>
-          <w:rFonts w:ascii="inherit" w:hAnsi="inherit"/>
-          <w:color w:val="0C0C0C"/>
-          <w:spacing w:val="24"/>
-        </w:rPr>
-        <w:t>i</w:t>
-      </w:r>
-      <w:proofErr w:type="spellEnd"/>
-      <w:r>
-        <w:rPr>
-          <w:rStyle w:val="HTMLCode"/>
-          <w:rFonts w:ascii="inherit" w:hAnsi="inherit"/>
-          <w:color w:val="0C0C0C"/>
-          <w:spacing w:val="24"/>
-        </w:rPr>
-        <w:t xml:space="preserve"> &lt; </w:t>
-      </w:r>
-      <w:proofErr w:type="spellStart"/>
-      <w:r>
-        <w:rPr>
-          <w:rStyle w:val="HTMLCode"/>
-          <w:rFonts w:ascii="inherit" w:hAnsi="inherit"/>
-          <w:color w:val="0C0C0C"/>
-          <w:spacing w:val="24"/>
-        </w:rPr>
-        <w:t>endIndex</w:t>
-      </w:r>
-      <w:proofErr w:type="spellEnd"/>
-      <w:r>
-        <w:rPr>
-          <w:rStyle w:val="HTMLCode"/>
-          <w:rFonts w:ascii="inherit" w:hAnsi="inherit"/>
-          <w:color w:val="0C0C0C"/>
-          <w:spacing w:val="24"/>
-        </w:rPr>
-        <w:t xml:space="preserve">; </w:t>
-      </w:r>
-      <w:proofErr w:type="spellStart"/>
-      <w:r>
-        <w:rPr>
-          <w:rStyle w:val="HTMLCode"/>
-          <w:rFonts w:ascii="inherit" w:hAnsi="inherit"/>
-          <w:color w:val="0C0C0C"/>
-          <w:spacing w:val="24"/>
-        </w:rPr>
-        <w:t>i</w:t>
-      </w:r>
-      <w:proofErr w:type="spellEnd"/>
-      <w:r>
-        <w:rPr>
-          <w:rStyle w:val="HTMLCode"/>
-          <w:rFonts w:ascii="inherit" w:hAnsi="inherit"/>
-          <w:color w:val="0C0C0C"/>
-          <w:spacing w:val="24"/>
-        </w:rPr>
-        <w:t>++) {</w:t>
+        <w:t>] * 2;</w:t>
       </w:r>
     </w:p>
     <w:p>
@@ -12137,27 +12762,7 @@
           <w:color w:val="0C0C0C"/>
           <w:spacing w:val="24"/>
         </w:rPr>
-        <w:t xml:space="preserve">        result += array[</w:t>
-      </w:r>
-      <w:proofErr w:type="spellStart"/>
-      <w:r>
-        <w:rPr>
-          <w:rStyle w:val="HTMLCode"/>
-          <w:rFonts w:ascii="inherit" w:hAnsi="inherit"/>
-          <w:color w:val="0C0C0C"/>
-          <w:spacing w:val="24"/>
-        </w:rPr>
-        <w:t>i</w:t>
-      </w:r>
-      <w:proofErr w:type="spellEnd"/>
-      <w:r>
-        <w:rPr>
-          <w:rStyle w:val="HTMLCode"/>
-          <w:rFonts w:ascii="inherit" w:hAnsi="inherit"/>
-          <w:color w:val="0C0C0C"/>
-          <w:spacing w:val="24"/>
-        </w:rPr>
-        <w:t>] * 2;</w:t>
+        <w:t xml:space="preserve">      }</w:t>
       </w:r>
     </w:p>
     <w:p>
@@ -12179,7 +12784,7 @@
           <w:color w:val="0C0C0C"/>
           <w:spacing w:val="24"/>
         </w:rPr>
-        <w:t xml:space="preserve">      }</w:t>
+        <w:t xml:space="preserve">    } else {</w:t>
       </w:r>
     </w:p>
     <w:p>
@@ -12201,7 +12806,47 @@
           <w:color w:val="0C0C0C"/>
           <w:spacing w:val="24"/>
         </w:rPr>
-        <w:t xml:space="preserve">    } else {</w:t>
+        <w:t xml:space="preserve">      int mid = (</w:t>
+      </w:r>
+      <w:proofErr w:type="spellStart"/>
+      <w:r>
+        <w:rPr>
+          <w:rStyle w:val="HTMLCode"/>
+          <w:rFonts w:ascii="inherit" w:hAnsi="inherit"/>
+          <w:color w:val="0C0C0C"/>
+          <w:spacing w:val="24"/>
+        </w:rPr>
+        <w:t>startIndex</w:t>
+      </w:r>
+      <w:proofErr w:type="spellEnd"/>
+      <w:r>
+        <w:rPr>
+          <w:rStyle w:val="HTMLCode"/>
+          <w:rFonts w:ascii="inherit" w:hAnsi="inherit"/>
+          <w:color w:val="0C0C0C"/>
+          <w:spacing w:val="24"/>
+        </w:rPr>
+        <w:t xml:space="preserve"> + </w:t>
+      </w:r>
+      <w:proofErr w:type="spellStart"/>
+      <w:r>
+        <w:rPr>
+          <w:rStyle w:val="HTMLCode"/>
+          <w:rFonts w:ascii="inherit" w:hAnsi="inherit"/>
+          <w:color w:val="0C0C0C"/>
+          <w:spacing w:val="24"/>
+        </w:rPr>
+        <w:t>endIndex</w:t>
+      </w:r>
+      <w:proofErr w:type="spellEnd"/>
+      <w:r>
+        <w:rPr>
+          <w:rStyle w:val="HTMLCode"/>
+          <w:rFonts w:ascii="inherit" w:hAnsi="inherit"/>
+          <w:color w:val="0C0C0C"/>
+          <w:spacing w:val="24"/>
+        </w:rPr>
+        <w:t>) / 2;</w:t>
       </w:r>
     </w:p>
     <w:p>
@@ -12223,7 +12868,78 @@
           <w:color w:val="0C0C0C"/>
           <w:spacing w:val="24"/>
         </w:rPr>
-        <w:t xml:space="preserve">      int mid = (</w:t>
+        <w:t xml:space="preserve">      </w:t>
+      </w:r>
+      <w:proofErr w:type="spellStart"/>
+      <w:r>
+        <w:rPr>
+          <w:rStyle w:val="HTMLCode"/>
+          <w:rFonts w:ascii="inherit" w:hAnsi="inherit"/>
+          <w:color w:val="0C0C0C"/>
+          <w:spacing w:val="24"/>
+        </w:rPr>
+        <w:t>DoubleNumber</w:t>
+      </w:r>
+      <w:proofErr w:type="spellEnd"/>
+      <w:r>
+        <w:rPr>
+          <w:rStyle w:val="HTMLCode"/>
+          <w:rFonts w:ascii="inherit" w:hAnsi="inherit"/>
+          <w:color w:val="0C0C0C"/>
+          <w:spacing w:val="24"/>
+        </w:rPr>
+        <w:t xml:space="preserve"> </w:t>
+      </w:r>
+      <w:proofErr w:type="spellStart"/>
+      <w:r>
+        <w:rPr>
+          <w:rStyle w:val="HTMLCode"/>
+          <w:rFonts w:ascii="inherit" w:hAnsi="inherit"/>
+          <w:color w:val="0C0C0C"/>
+          <w:spacing w:val="24"/>
+        </w:rPr>
+        <w:t>leftArray</w:t>
+      </w:r>
+      <w:proofErr w:type="spellEnd"/>
+      <w:r>
+        <w:rPr>
+          <w:rStyle w:val="HTMLCode"/>
+          <w:rFonts w:ascii="inherit" w:hAnsi="inherit"/>
+          <w:color w:val="0C0C0C"/>
+          <w:spacing w:val="24"/>
+        </w:rPr>
+        <w:t xml:space="preserve"> = new </w:t>
+      </w:r>
+      <w:proofErr w:type="spellStart"/>
+      <w:proofErr w:type="gramStart"/>
+      <w:r>
+        <w:rPr>
+          <w:rStyle w:val="HTMLCode"/>
+          <w:rFonts w:ascii="inherit" w:hAnsi="inherit"/>
+          <w:color w:val="0C0C0C"/>
+          <w:spacing w:val="24"/>
+        </w:rPr>
+        <w:t>DoubleNumber</w:t>
+      </w:r>
+      <w:proofErr w:type="spellEnd"/>
+      <w:r>
+        <w:rPr>
+          <w:rStyle w:val="HTMLCode"/>
+          <w:rFonts w:ascii="inherit" w:hAnsi="inherit"/>
+          <w:color w:val="0C0C0C"/>
+          <w:spacing w:val="24"/>
+        </w:rPr>
+        <w:t>(</w:t>
+      </w:r>
+      <w:proofErr w:type="gramEnd"/>
+      <w:r>
+        <w:rPr>
+          <w:rStyle w:val="HTMLCode"/>
+          <w:rFonts w:ascii="inherit" w:hAnsi="inherit"/>
+          <w:color w:val="0C0C0C"/>
+          <w:spacing w:val="24"/>
+        </w:rPr>
+        <w:t xml:space="preserve">array, </w:t>
       </w:r>
       <w:proofErr w:type="spellStart"/>
       <w:r>
@@ -12243,27 +12959,7 @@
           <w:color w:val="0C0C0C"/>
           <w:spacing w:val="24"/>
         </w:rPr>
-        <w:t xml:space="preserve"> + </w:t>
-      </w:r>
-      <w:proofErr w:type="spellStart"/>
-      <w:r>
-        <w:rPr>
-          <w:rStyle w:val="HTMLCode"/>
-          <w:rFonts w:ascii="inherit" w:hAnsi="inherit"/>
-          <w:color w:val="0C0C0C"/>
-          <w:spacing w:val="24"/>
-        </w:rPr>
-        <w:t>endIndex</w:t>
-      </w:r>
-      <w:proofErr w:type="spellEnd"/>
-      <w:r>
-        <w:rPr>
-          <w:rStyle w:val="HTMLCode"/>
-          <w:rFonts w:ascii="inherit" w:hAnsi="inherit"/>
-          <w:color w:val="0C0C0C"/>
-          <w:spacing w:val="24"/>
-        </w:rPr>
-        <w:t>) / 2;</w:t>
+        <w:t>, mid);</w:t>
       </w:r>
     </w:p>
     <w:p>
@@ -12286,119 +12982,6 @@
           <w:spacing w:val="24"/>
         </w:rPr>
         <w:lastRenderedPageBreak/>
-        <w:t xml:space="preserve">      </w:t>
-      </w:r>
-      <w:proofErr w:type="spellStart"/>
-      <w:r>
-        <w:rPr>
-          <w:rStyle w:val="HTMLCode"/>
-          <w:rFonts w:ascii="inherit" w:hAnsi="inherit"/>
-          <w:color w:val="0C0C0C"/>
-          <w:spacing w:val="24"/>
-        </w:rPr>
-        <w:t>DoubleNumber</w:t>
-      </w:r>
-      <w:proofErr w:type="spellEnd"/>
-      <w:r>
-        <w:rPr>
-          <w:rStyle w:val="HTMLCode"/>
-          <w:rFonts w:ascii="inherit" w:hAnsi="inherit"/>
-          <w:color w:val="0C0C0C"/>
-          <w:spacing w:val="24"/>
-        </w:rPr>
-        <w:t xml:space="preserve"> </w:t>
-      </w:r>
-      <w:proofErr w:type="spellStart"/>
-      <w:r>
-        <w:rPr>
-          <w:rStyle w:val="HTMLCode"/>
-          <w:rFonts w:ascii="inherit" w:hAnsi="inherit"/>
-          <w:color w:val="0C0C0C"/>
-          <w:spacing w:val="24"/>
-        </w:rPr>
-        <w:t>leftArray</w:t>
-      </w:r>
-      <w:proofErr w:type="spellEnd"/>
-      <w:r>
-        <w:rPr>
-          <w:rStyle w:val="HTMLCode"/>
-          <w:rFonts w:ascii="inherit" w:hAnsi="inherit"/>
-          <w:color w:val="0C0C0C"/>
-          <w:spacing w:val="24"/>
-        </w:rPr>
-        <w:t xml:space="preserve"> = new </w:t>
-      </w:r>
-      <w:proofErr w:type="spellStart"/>
-      <w:proofErr w:type="gramStart"/>
-      <w:r>
-        <w:rPr>
-          <w:rStyle w:val="HTMLCode"/>
-          <w:rFonts w:ascii="inherit" w:hAnsi="inherit"/>
-          <w:color w:val="0C0C0C"/>
-          <w:spacing w:val="24"/>
-        </w:rPr>
-        <w:t>DoubleNumber</w:t>
-      </w:r>
-      <w:proofErr w:type="spellEnd"/>
-      <w:r>
-        <w:rPr>
-          <w:rStyle w:val="HTMLCode"/>
-          <w:rFonts w:ascii="inherit" w:hAnsi="inherit"/>
-          <w:color w:val="0C0C0C"/>
-          <w:spacing w:val="24"/>
-        </w:rPr>
-        <w:t>(</w:t>
-      </w:r>
-      <w:proofErr w:type="gramEnd"/>
-      <w:r>
-        <w:rPr>
-          <w:rStyle w:val="HTMLCode"/>
-          <w:rFonts w:ascii="inherit" w:hAnsi="inherit"/>
-          <w:color w:val="0C0C0C"/>
-          <w:spacing w:val="24"/>
-        </w:rPr>
-        <w:t xml:space="preserve">array, </w:t>
-      </w:r>
-      <w:proofErr w:type="spellStart"/>
-      <w:r>
-        <w:rPr>
-          <w:rStyle w:val="HTMLCode"/>
-          <w:rFonts w:ascii="inherit" w:hAnsi="inherit"/>
-          <w:color w:val="0C0C0C"/>
-          <w:spacing w:val="24"/>
-        </w:rPr>
-        <w:t>startIndex</w:t>
-      </w:r>
-      <w:proofErr w:type="spellEnd"/>
-      <w:r>
-        <w:rPr>
-          <w:rStyle w:val="HTMLCode"/>
-          <w:rFonts w:ascii="inherit" w:hAnsi="inherit"/>
-          <w:color w:val="0C0C0C"/>
-          <w:spacing w:val="24"/>
-        </w:rPr>
-        <w:t>, mid);</w:t>
-      </w:r>
-    </w:p>
-    <w:p>
-      <w:pPr>
-        <w:pStyle w:val="HTMLPreformatted"/>
-        <w:shd w:val="clear" w:color="auto" w:fill="F1F1F1"/>
-        <w:spacing w:after="600"/>
-        <w:rPr>
-          <w:rStyle w:val="HTMLCode"/>
-          <w:rFonts w:ascii="inherit" w:hAnsi="inherit"/>
-          <w:color w:val="0C0C0C"/>
-          <w:spacing w:val="24"/>
-        </w:rPr>
-      </w:pPr>
-      <w:r>
-        <w:rPr>
-          <w:rStyle w:val="HTMLCode"/>
-          <w:rFonts w:ascii="inherit" w:hAnsi="inherit"/>
-          <w:color w:val="0C0C0C"/>
-          <w:spacing w:val="24"/>
-        </w:rPr>
         <w:t xml:space="preserve">      </w:t>
       </w:r>
       <w:proofErr w:type="spellStart"/>
@@ -16810,6 +17393,27 @@
     <w:name w:val="Normal"/>
     <w:qFormat/>
   </w:style>
+  <w:style w:type="paragraph" w:styleId="Heading1">
+    <w:name w:val="heading 1"/>
+    <w:basedOn w:val="Normal"/>
+    <w:next w:val="Normal"/>
+    <w:link w:val="Heading1Char"/>
+    <w:uiPriority w:val="9"/>
+    <w:qFormat/>
+    <w:rsid w:val="008C224C"/>
+    <w:pPr>
+      <w:keepNext/>
+      <w:keepLines/>
+      <w:spacing w:before="240" w:after="0"/>
+      <w:outlineLvl w:val="0"/>
+    </w:pPr>
+    <w:rPr>
+      <w:rFonts w:asciiTheme="majorHAnsi" w:eastAsiaTheme="majorEastAsia" w:hAnsiTheme="majorHAnsi" w:cstheme="majorBidi"/>
+      <w:color w:val="2F5496" w:themeColor="accent1" w:themeShade="BF"/>
+      <w:sz w:val="32"/>
+      <w:szCs w:val="32"/>
+    </w:rPr>
+  </w:style>
   <w:style w:type="paragraph" w:styleId="Heading2">
     <w:name w:val="heading 2"/>
     <w:basedOn w:val="Normal"/>
@@ -16942,7 +17546,6 @@
     <w:name w:val="Normal (Web)"/>
     <w:basedOn w:val="Normal"/>
     <w:uiPriority w:val="99"/>
-    <w:semiHidden/>
     <w:unhideWhenUsed/>
     <w:rsid w:val="00B26A0E"/>
     <w:pPr>
@@ -17052,8 +17655,8 @@
       <w:iCs/>
     </w:rPr>
   </w:style>
-  <w:style w:type="paragraph" w:customStyle="1" w:styleId="caption">
-    <w:name w:val="caption"/>
+  <w:style w:type="paragraph" w:customStyle="1" w:styleId="Caption1">
+    <w:name w:val="Caption1"/>
     <w:basedOn w:val="Normal"/>
     <w:rsid w:val="00B26A0E"/>
     <w:pPr>
@@ -17120,6 +17723,29 @@
       <w:lang w:eastAsia="en-IN"/>
       <w14:ligatures w14:val="none"/>
     </w:rPr>
+  </w:style>
+  <w:style w:type="character" w:customStyle="1" w:styleId="Heading1Char">
+    <w:name w:val="Heading 1 Char"/>
+    <w:basedOn w:val="DefaultParagraphFont"/>
+    <w:link w:val="Heading1"/>
+    <w:uiPriority w:val="9"/>
+    <w:rsid w:val="008C224C"/>
+    <w:rPr>
+      <w:rFonts w:asciiTheme="majorHAnsi" w:eastAsiaTheme="majorEastAsia" w:hAnsiTheme="majorHAnsi" w:cstheme="majorBidi"/>
+      <w:color w:val="2F5496" w:themeColor="accent1" w:themeShade="BF"/>
+      <w:sz w:val="32"/>
+      <w:szCs w:val="32"/>
+    </w:rPr>
+  </w:style>
+  <w:style w:type="character" w:customStyle="1" w:styleId="jw-time-update">
+    <w:name w:val="jw-time-update"/>
+    <w:basedOn w:val="DefaultParagraphFont"/>
+    <w:rsid w:val="008C224C"/>
+  </w:style>
+  <w:style w:type="character" w:customStyle="1" w:styleId="jw-volume-update">
+    <w:name w:val="jw-volume-update"/>
+    <w:basedOn w:val="DefaultParagraphFont"/>
+    <w:rsid w:val="008C224C"/>
   </w:style>
 </w:styles>
 </file>

</xml_diff>